<commit_message>
Actualizar documento tecnico y evidencias de registro y compras
</commit_message>
<xml_diff>
--- a/docs/Documento tecnico Feria NewMix.docx
+++ b/docs/Documento tecnico Feria NewMix.docx
@@ -35,7 +35,7 @@
         <w:widowControl/>
       </w:pPr>
       <w:r>
-        <w:t>Revisión técnica del 3 de octubre de 2026. Capturas del 2 de octubre, excepto Django Admin del 3 de octubre.</w:t>
+        <w:t>Revisión técnica del 3 de octubre de 2026. Capturas de administración del 2 de octubre y de Admin y compras del 3 de octubre.</w:t>
       </w:r>
     </w:p>
     <w:p>
@@ -52,7 +52,7 @@
         <w:widowControl/>
       </w:pPr>
       <w:r>
-        <w:t>Feria NewMix permite administrar artistas, discos y clientes, además de registrar ventas de discos. El proyecto amplía el prototipo de catálogo musical para trabajar con información almacenada en una base de datos relacional, formularios y permisos de usuario.</w:t>
+        <w:t>Feria NewMix permite administrar artistas, discos y clientes, además de registrar ventas. Desde el inicio público, una persona puede crear su cuenta de cliente, iniciar sesión, comprar discos y consultar sus compras. El proyecto amplía el catálogo musical con información almacenada en una base de datos relacional, formularios y permisos.</w:t>
       </w:r>
     </w:p>
     <w:p>
@@ -60,7 +60,7 @@
         <w:widowControl/>
       </w:pPr>
       <w:r>
-        <w:t>La aplicación funciona y se ha comprobado localmente con SQLite. Incluye modelos ORM, migraciones, CRUD desde la web y Django Admin, imágenes, documentos PDF y tres perfiles. El despliegue en EC2, el repositorio GitHub y la revisión de MySQL desde phpMyAdmin siguen pendientes de comprobación. Por ello, este documento no declara completados todos los requisitos de la evaluación.</w:t>
+        <w:t>La aplicación funciona y se ha comprobado localmente con SQLite. Incluye modelos ORM, migraciones, CRUD desde la web y Django Admin, imágenes, documentos PDF y cuatro perfiles. El proyecto está publicado en GitHub. El despliegue en EC2 y la revisión de MySQL desde phpMyAdmin siguen pendientes. Por ello, este documento no declara completados todos los requisitos de la evaluación.</w:t>
       </w:r>
     </w:p>
     <w:p>
@@ -77,7 +77,7 @@
         <w:widowControl/>
       </w:pPr>
       <w:r>
-        <w:t>Organizar el catálogo musical y registrar ventas que relacionen un cliente con un disco, manteniendo cantidades y precios coherentes. La interfaz debe permitir agregar, consultar, buscar, modificar y eliminar información según los permisos de cada usuario.</w:t>
+        <w:t>Organizar el catálogo musical y registrar ventas que relacionen un cliente con un disco, manteniendo cantidades y precios coherentes. El personal administra los datos según permisos. El cliente puede registrarse, comprar y revisar únicamente sus propias compras.</w:t>
       </w:r>
     </w:p>
     <w:p>
@@ -111,7 +111,7 @@
         <w:widowControl/>
       </w:pPr>
       <w:r>
-        <w:t>Cada venta registra un solo disco, su cliente, fecha, cantidad y precio unitario. No se implementan carrito ni pagos en línea. El catálogo de origen contiene 13 artistas, 37 discos y 50 imágenes. Los JSON se conservan como fuente de importación; las páginas obtienen la información del ORM.</w:t>
+        <w:t>Cada compra registra una Venta con un solo disco, cliente, fecha, cantidad y precio unitario, y descuenta su stock. El sistema registra la compra sin procesar un pago real; no se implementan carrito ni pagos en línea. El catálogo original contiene 13 artistas, 37 discos y 50 imágenes. Los JSON son la fuente de importación y las páginas consultan el ORM.</w:t>
       </w:r>
     </w:p>
     <w:p>
@@ -119,7 +119,7 @@
         <w:widowControl/>
       </w:pPr>
       <w:r>
-        <w:t>Las capturas de clientes y ventas corresponden a una demostración técnica con el nombre Cliente de prueba técnica y un correo example.com. No representan clientes ni ventas reales. Al cerrar la revisión se retiraron los registros temporales: la base conserva 13 artistas y 37 discos, con cero clientes y cero ventas. Las capturas documentan las operaciones realizadas antes de esa limpieza.</w:t>
+        <w:t>Las capturas de clientes, ventas y compras corresponden a demostraciones técnicas identificadas como prueba y con correos example.com. No representan clientes ni compras reales. Se conservan como evidencia de las operaciones realizadas, aunque los registros temporales se retiren después.</w:t>
       </w:r>
     </w:p>
     <w:p>
@@ -483,7 +483,7 @@
                 <w:b w:val="0"/>
                 <w:sz w:val="20"/>
               </w:rPr>
-              <w:t>Modelos Cliente y Venta, formularios, CRUD y movimiento de stock.</w:t>
+              <w:t>Cliente y Venta, CRUD, compras propias y movimiento de stock.</w:t>
             </w:r>
           </w:p>
         </w:tc>
@@ -548,7 +548,7 @@
                 <w:b w:val="0"/>
                 <w:sz w:val="20"/>
               </w:rPr>
-              <w:t>Comando para crear los tres grupos de permisos.</w:t>
+              <w:t>Registro de clientes y creación de los cuatro grupos de permisos.</w:t>
             </w:r>
           </w:p>
         </w:tc>
@@ -613,7 +613,7 @@
                 <w:b w:val="0"/>
                 <w:sz w:val="20"/>
               </w:rPr>
-              <w:t>Base común, listas, formulario, confirmación y login.</w:t>
+              <w:t>Base común, listas, formularios, confirmaciones, login y registro.</w:t>
             </w:r>
           </w:p>
         </w:tc>
@@ -834,7 +834,7 @@
         <w:widowControl/>
       </w:pPr>
       <w:r>
-        <w:t>config/urls.py utiliza include() para conectar artistas/, discos/, ventas/ y cuentas/. También incluye admin/ y la ruta de inicio. Cada aplicación mantiene su urls.py. Las plantillas usan nombres de rutas con {% url %}, lo que evita repetir direcciones dentro de los enlaces.</w:t>
+        <w:t>config/urls.py utiliza include() para conectar artistas/, discos/, ventas/ y cuentas/, además de admin/ e inicio. Cada aplicación mantiene su urls.py. Las plantillas enlazan los nombres de rutas con {% url %}. La compra utiliza /ventas/comprar/&lt;id&gt;/ y el registro utiliza /cuentas/registro/.</w:t>
       </w:r>
     </w:p>
     <w:tbl>
@@ -1141,7 +1141,7 @@
                 <w:b w:val="0"/>
                 <w:sz w:val="20"/>
               </w:rPr>
-              <w:t>/ventas/</w:t>
+              <w:t>/ventas/ y /ventas/mis-compras/</w:t>
             </w:r>
           </w:p>
         </w:tc>
@@ -1171,7 +1171,7 @@
                 <w:b w:val="0"/>
                 <w:sz w:val="20"/>
               </w:rPr>
-              <w:t>Listado y registro de ventas.</w:t>
+              <w:t>Ventas del personal e historial privado del cliente.</w:t>
             </w:r>
           </w:p>
         </w:tc>
@@ -1206,7 +1206,7 @@
                 <w:b w:val="0"/>
                 <w:sz w:val="20"/>
               </w:rPr>
-              <w:t>/cuentas/login/ y /cuentas/logout/</w:t>
+              <w:t>/cuentas/</w:t>
             </w:r>
           </w:p>
         </w:tc>
@@ -1236,7 +1236,7 @@
                 <w:b w:val="0"/>
                 <w:sz w:val="20"/>
               </w:rPr>
-              <w:t>Inicio y cierre de sesión.</w:t>
+              <w:t>Registro, inicio y cierre de sesión.</w:t>
             </w:r>
           </w:p>
         </w:tc>
@@ -1626,7 +1626,7 @@
                 <w:b w:val="0"/>
                 <w:sz w:val="20"/>
               </w:rPr>
-              <w:t>nombre: CharField; correo: EmailField; teléfono opcional: CharField.</w:t>
+              <w:t>nombre: CharField; correo: EmailField; teléfono opcional: CharField; usuario opcional: OneToOneField con User de Django.</w:t>
             </w:r>
           </w:p>
         </w:tc>
@@ -2099,6 +2099,101 @@
           </w:p>
         </w:tc>
       </w:tr>
+      <w:tr>
+        <w:trPr>
+          <w:cantSplit/>
+        </w:trPr>
+        <w:tc>
+          <w:tcPr>
+            <w:tcW w:type="dxa" w:w="3969"/>
+            <w:vAlign w:val="center"/>
+            <w:tcBorders>
+              <w:top w:val="single" w:sz="4" w:color="D9D9D9"/>
+              <w:left w:val="single" w:sz="4" w:color="D9D9D9"/>
+              <w:bottom w:val="single" w:sz="4" w:color="D9D9D9"/>
+              <w:right w:val="single" w:sz="4" w:color="D9D9D9"/>
+            </w:tcBorders>
+            <w:tcMar>
+              <w:top w:w="65" w:type="dxa"/>
+              <w:left w:w="65" w:type="dxa"/>
+              <w:bottom w:w="65" w:type="dxa"/>
+              <w:right w:w="65" w:type="dxa"/>
+            </w:tcMar>
+          </w:tcPr>
+          <w:p>
+            <w:pPr>
+              <w:spacing w:after="40" w:before="40" w:line="245" w:lineRule="auto"/>
+            </w:pPr>
+            <w:r>
+              <w:rPr>
+                <w:b w:val="0"/>
+                <w:sz w:val="20"/>
+              </w:rPr>
+              <w:t>Cliente → User de Django</w:t>
+            </w:r>
+          </w:p>
+        </w:tc>
+        <w:tc>
+          <w:tcPr>
+            <w:tcW w:type="dxa" w:w="3402"/>
+            <w:vAlign w:val="center"/>
+            <w:tcBorders>
+              <w:top w:val="single" w:sz="4" w:color="D9D9D9"/>
+              <w:left w:val="single" w:sz="4" w:color="D9D9D9"/>
+              <w:bottom w:val="single" w:sz="4" w:color="D9D9D9"/>
+              <w:right w:val="single" w:sz="4" w:color="D9D9D9"/>
+            </w:tcBorders>
+            <w:tcMar>
+              <w:top w:w="65" w:type="dxa"/>
+              <w:left w:w="65" w:type="dxa"/>
+              <w:bottom w:w="65" w:type="dxa"/>
+              <w:right w:w="65" w:type="dxa"/>
+            </w:tcMar>
+          </w:tcPr>
+          <w:p>
+            <w:pPr>
+              <w:spacing w:after="40" w:before="40" w:line="245" w:lineRule="auto"/>
+            </w:pPr>
+            <w:r>
+              <w:rPr>
+                <w:b w:val="0"/>
+                <w:sz w:val="20"/>
+              </w:rPr>
+              <w:t>Uno a uno opcional</w:t>
+            </w:r>
+          </w:p>
+        </w:tc>
+        <w:tc>
+          <w:tcPr>
+            <w:tcW w:type="dxa" w:w="2268"/>
+            <w:vAlign w:val="center"/>
+            <w:tcBorders>
+              <w:top w:val="single" w:sz="4" w:color="D9D9D9"/>
+              <w:left w:val="single" w:sz="4" w:color="D9D9D9"/>
+              <w:bottom w:val="single" w:sz="4" w:color="D9D9D9"/>
+              <w:right w:val="single" w:sz="4" w:color="D9D9D9"/>
+            </w:tcBorders>
+            <w:tcMar>
+              <w:top w:w="65" w:type="dxa"/>
+              <w:left w:w="65" w:type="dxa"/>
+              <w:bottom w:w="65" w:type="dxa"/>
+              <w:right w:w="65" w:type="dxa"/>
+            </w:tcMar>
+          </w:tcPr>
+          <w:p>
+            <w:pPr>
+              <w:spacing w:after="40" w:before="40" w:line="245" w:lineRule="auto"/>
+            </w:pPr>
+            <w:r>
+              <w:rPr>
+                <w:b w:val="0"/>
+                <w:sz w:val="20"/>
+              </w:rPr>
+              <w:t>SET_NULL</w:t>
+            </w:r>
+          </w:p>
+        </w:tc>
+      </w:tr>
     </w:tbl>
     <w:p>
       <w:pPr>
@@ -2111,7 +2206,7 @@
         <w:widowControl/>
       </w:pPr>
       <w:r>
-        <w:t>Un artista puede tener varios discos. Un cliente puede tener varias ventas y un disco puede aparecer en varias ventas. Cada venta contiene exactamente un cliente y un disco. PROTECT impide eliminar registros que aún tienen dependencias: un artista con discos, o un cliente o disco con ventas asociadas.</w:t>
+        <w:t>Cada venta tiene un cliente y un disco. Un artista puede tener varios discos y cada cliente o disco, varias ventas. PROTECT impide eliminar un artista con discos o un cliente o disco con ventas. Cliente.usuario vincula opcionalmente una cuenta: se mantienen clientes creados por el personal sin cuenta. SET_NULL conserva el cliente y sus ventas si se elimina el usuario.</w:t>
       </w:r>
     </w:p>
     <w:p>
@@ -2128,7 +2223,7 @@
         <w:widowControl/>
       </w:pPr>
       <w:r>
-        <w:t>Los precios se expresan en pesos chilenos mediante DecimalField, con cero decimales. Venta conserva el precio unitario del momento del registro: cambiar después el precio del catálogo no modifica una venta anterior. El total se calcula con la propiedad total y no se guarda como un campo independiente.</w:t>
+        <w:t>Los precios se expresan en pesos chilenos mediante DecimalField, con cero decimales. El formulario de Venta copia el precio exacto del Disco seleccionado y lo guarda como precio unitario. Una edición del mismo disco conserva el precio histórico; elegir otro disco copia el precio de ese disco. Cambiar el precio del catálogo no modifica las ventas anteriores. La propiedad total calcula el importe sin guardarlo como un campo independiente.</w:t>
       </w:r>
     </w:p>
     <w:p>
@@ -2216,7 +2311,7 @@
         <w:widowControl/>
       </w:pPr>
       <w:r>
-        <w:t>migrate aplica los cambios descritos por las migraciones. makemigrations se utiliza al modificar los modelos. importar_catalogo agrega los datos originales que todavía no existen y copia sus imágenes a media/, conservando los IDs y las ediciones existentes al repetir el comando.</w:t>
+        <w:t>migrate aplica las migraciones, incluida 0002_cliente_usuario que vincula Cliente con la cuenta. makemigrations se usa al modificar modelos. importar_catalogo agrega datos originales que no existen y copia imágenes a media/, conservando IDs y ediciones al repetirlo.</w:t>
       </w:r>
     </w:p>
     <w:p>
@@ -2335,7 +2430,7 @@
         <w:widowControl/>
       </w:pPr>
       <w:r>
-        <w:t>ArtistaForm, DiscoForm, ClienteForm y VentaForm heredan de ModelForm. Cada uno define sus campos y widgets de Bootstrap. En GET se muestra el formulario; en POST se reciben los datos, se llama a is_valid() y se guarda si son correctos. Al editar se entrega instance=registro para mostrar valores precargados.</w:t>
+        <w:t>ArtistaForm, DiscoForm, ClienteForm y VentaForm heredan de ModelForm. GET muestra los campos y POST valida con is_valid() antes de guardar. instance=registro precarga la edición. RegistroClienteForm usa UserCreationForm: solicita usuario, nombre, correo, teléfono opcional y contraseña repetida; Django comprueba la contraseña y que el usuario no exista.</w:t>
       </w:r>
     </w:p>
     <w:p>
@@ -2351,12 +2446,13 @@
         <w:keepNext/>
         <w:widowControl/>
         <w:spacing w:after="60"/>
+        <w:jc w:val="center"/>
       </w:pPr>
       <w:r>
         <w:drawing>
           <wp:inline xmlns:a="http://schemas.openxmlformats.org/drawingml/2006/main" xmlns:pic="http://schemas.openxmlformats.org/drawingml/2006/picture">
-            <wp:extent cx="6120000" cy="3444617"/>
-            <wp:docPr id="2" name="Picture 2" descr="Formulario de cliente con datos identificados como prueba técnica."/>
+            <wp:extent cx="2880000" cy="3927272"/>
+            <wp:docPr id="2" name="Picture 2" descr="Formulario para registrar una cuenta de cliente."/>
             <wp:cNvGraphicFramePr>
               <a:graphicFrameLocks noChangeAspect="1"/>
             </wp:cNvGraphicFramePr>
@@ -2364,11 +2460,12 @@
               <a:graphicData uri="http://schemas.openxmlformats.org/drawingml/2006/picture">
                 <pic:pic>
                   <pic:nvPicPr>
-                    <pic:cNvPr id="0" name="06_agregar_cliente.jpg"/>
+                    <pic:cNvPr id="0" name="20_formulario_registro.png"/>
                     <pic:cNvPicPr/>
                   </pic:nvPicPr>
                   <pic:blipFill>
                     <a:blip r:embed="rId11"/>
+                    <a:srcRect l="24000" t="7500" r="24000" b="23500"/>
                     <a:stretch>
                       <a:fillRect/>
                     </a:stretch>
@@ -2376,7 +2473,7 @@
                   <pic:spPr>
                     <a:xfrm>
                       <a:off x="0" y="0"/>
-                      <a:ext cx="6120000" cy="3444617"/>
+                      <a:ext cx="2880000" cy="3927272"/>
                     </a:xfrm>
                     <a:prstGeom prst="rect"/>
                   </pic:spPr>
@@ -2393,7 +2490,7 @@
         <w:widowControl/>
       </w:pPr>
       <w:r>
-        <w:t>Figura 2. Formulario de cliente con datos identificados como prueba técnica.</w:t>
+        <w:t>Figura 2. Formulario para registrar una cuenta de cliente.</w:t>
       </w:r>
     </w:p>
     <w:tbl>
@@ -2505,7 +2602,7 @@
                 <w:b w:val="0"/>
                 <w:sz w:val="20"/>
               </w:rPr>
-              <w:t>Campos obligatorios</w:t>
+              <w:t>Campos y correo</w:t>
             </w:r>
           </w:p>
         </w:tc>
@@ -2535,7 +2632,7 @@
                 <w:b w:val="0"/>
                 <w:sz w:val="20"/>
               </w:rPr>
-              <w:t>No se guardan formularios incompletos; se muestran errores.</w:t>
+              <w:t>Se exigen los campos obligatorios y un correo válido.</w:t>
             </w:r>
           </w:p>
         </w:tc>
@@ -2570,7 +2667,7 @@
                 <w:b w:val="0"/>
                 <w:sz w:val="20"/>
               </w:rPr>
-              <w:t>Correo del cliente</w:t>
+              <w:t>Usuario y contraseña</w:t>
             </w:r>
           </w:p>
         </w:tc>
@@ -2600,7 +2697,7 @@
                 <w:b w:val="0"/>
                 <w:sz w:val="20"/>
               </w:rPr>
-              <w:t>EmailField comprueba que tenga una estructura válida.</w:t>
+              <w:t>UserCreationForm valida usuario único y las contraseñas.</w:t>
             </w:r>
           </w:p>
         </w:tc>
@@ -2830,7 +2927,7 @@
                 <w:b w:val="0"/>
                 <w:sz w:val="20"/>
               </w:rPr>
-              <w:t>Venta sin stock suficiente</w:t>
+              <w:t>Compra sin stock suficiente</w:t>
             </w:r>
           </w:p>
         </w:tc>
@@ -2860,7 +2957,7 @@
                 <w:b w:val="0"/>
                 <w:sz w:val="20"/>
               </w:rPr>
-              <w:t>Se rechaza la cantidad y se informa la disponibilidad.</w:t>
+              <w:t>Se rechaza la cantidad y se informa disponibilidad.</w:t>
             </w:r>
           </w:p>
         </w:tc>
@@ -2877,7 +2974,7 @@
         <w:widowControl/>
       </w:pPr>
       <w:r>
-        <w:t>Los atributos de los widgets ayudan al usuario, pero la comprobación principal se realiza en el servidor. Venta.clean() permite mostrar el error de stock en el formulario; Venta.save() vuelve a revisar antes de persistir. Si hay un error, el formulario conserva los datos para corregirlos.</w:t>
+        <w:t>CompraForm utiliza forms.Form y sólo recibe la cantidad. El servidor obtiene el cliente, disco, fecha y precio. Venta.clean() muestra errores de stock y Venta.save() vuelve a comprobarlo antes de guardar. El registro crea User y Cliente juntos mediante transaction.atomic(), asigna el perfil Cliente e inicia sesión automáticamente.</w:t>
       </w:r>
     </w:p>
     <w:p>
@@ -3031,7 +3128,7 @@
         <w:widowControl/>
       </w:pPr>
       <w:r>
-        <w:t>7 CRUD registro y modificación de ventas</w:t>
+        <w:t>7 Registro de ventas y compras de clientes</w:t>
       </w:r>
     </w:p>
     <w:p>
@@ -3039,7 +3136,7 @@
         <w:widowControl/>
       </w:pPr>
       <w:r>
-        <w:t>Al registrar una venta se eligen un cliente y un disco existentes. La venta guarda sus llaves foráneas, fecha, cantidad y precio. La prueba utilizó Toxicity a $21 990 por unidad: dos unidades producen un total de $43 980. Al modificar a tres unidades, el total pasa a $65 970.</w:t>
+        <w:t>El precio automático de venta se muestra en un campo deshabilitado. Al elegir un disco, JavaScript consulta su precio actual, incluso si se creó desde la ventana auxiliar de Admin. Django determina el precio al guardar e ignora el precio enviado manualmente. Registrar venta desde la ficha preselecciona el disco mediante ?disco=id; se completan cliente, fecha y cantidad.</w:t>
       </w:r>
     </w:p>
     <w:p>
@@ -3051,8 +3148,8 @@
       <w:r>
         <w:drawing>
           <wp:inline xmlns:a="http://schemas.openxmlformats.org/drawingml/2006/main" xmlns:pic="http://schemas.openxmlformats.org/drawingml/2006/picture">
-            <wp:extent cx="6120000" cy="3444617"/>
-            <wp:docPr id="5" name="Picture 5" descr="Alta de una venta de prueba con dos unidades y total de $43 980."/>
+            <wp:extent cx="5400000" cy="3039368"/>
+            <wp:docPr id="5" name="Picture 5" descr="Confirmación de dos unidades de AM a $21 990 cada una: total $43 980."/>
             <wp:cNvGraphicFramePr>
               <a:graphicFrameLocks noChangeAspect="1"/>
             </wp:cNvGraphicFramePr>
@@ -3060,7 +3157,7 @@
               <a:graphicData uri="http://schemas.openxmlformats.org/drawingml/2006/picture">
                 <pic:pic>
                   <pic:nvPicPr>
-                    <pic:cNvPr id="0" name="09_venta_creada.jpg"/>
+                    <pic:cNvPr id="0" name="21_confirmar_compra.png"/>
                     <pic:cNvPicPr/>
                   </pic:nvPicPr>
                   <pic:blipFill>
@@ -3072,7 +3169,7 @@
                   <pic:spPr>
                     <a:xfrm>
                       <a:off x="0" y="0"/>
-                      <a:ext cx="6120000" cy="3444617"/>
+                      <a:ext cx="5400000" cy="3039368"/>
                     </a:xfrm>
                     <a:prstGeom prst="rect"/>
                   </pic:spPr>
@@ -3089,7 +3186,7 @@
         <w:widowControl/>
       </w:pPr>
       <w:r>
-        <w:t>Figura 5. Alta de una venta de prueba con dos unidades y total de $43 980.</w:t>
+        <w:t>Figura 5. Confirmación de dos unidades de AM a $21 990 cada una: total $43 980.</w:t>
       </w:r>
     </w:p>
     <w:p>
@@ -3101,8 +3198,8 @@
       <w:r>
         <w:drawing>
           <wp:inline xmlns:a="http://schemas.openxmlformats.org/drawingml/2006/main" xmlns:pic="http://schemas.openxmlformats.org/drawingml/2006/picture">
-            <wp:extent cx="6120000" cy="3444617"/>
-            <wp:docPr id="6" name="Picture 6" descr="Venta de prueba modificada a tres unidades y total de $65 970."/>
+            <wp:extent cx="5400000" cy="3039368"/>
+            <wp:docPr id="6" name="Picture 6" descr="Mis compras muestra únicamente las ventas de la cuenta autenticada."/>
             <wp:cNvGraphicFramePr>
               <a:graphicFrameLocks noChangeAspect="1"/>
             </wp:cNvGraphicFramePr>
@@ -3110,7 +3207,7 @@
               <a:graphicData uri="http://schemas.openxmlformats.org/drawingml/2006/picture">
                 <pic:pic>
                   <pic:nvPicPr>
-                    <pic:cNvPr id="0" name="10_venta_editada.jpg"/>
+                    <pic:cNvPr id="0" name="22_mis_compras.png"/>
                     <pic:cNvPicPr/>
                   </pic:nvPicPr>
                   <pic:blipFill>
@@ -3122,7 +3219,7 @@
                   <pic:spPr>
                     <a:xfrm>
                       <a:off x="0" y="0"/>
-                      <a:ext cx="6120000" cy="3444617"/>
+                      <a:ext cx="5400000" cy="3039368"/>
                     </a:xfrm>
                     <a:prstGeom prst="rect"/>
                   </pic:spPr>
@@ -3139,7 +3236,7 @@
         <w:widowControl/>
       </w:pPr>
       <w:r>
-        <w:t>Figura 6. Venta de prueba modificada a tres unidades y total de $65 970.</w:t>
+        <w:t>Figura 6. Mis compras muestra únicamente las ventas de la cuenta autenticada.</w:t>
       </w:r>
     </w:p>
     <w:p>
@@ -3147,7 +3244,7 @@
         <w:widowControl/>
       </w:pPr>
       <w:r>
-        <w:t>La edición recupera la venta con get_object_or_404() y entrega instance al formulario. Tras guardar, la vista redirige a la lista y muestra un mensaje. Estas capturas documentan operaciones de prueba; no son comprobantes de ventas reales.</w:t>
+        <w:t>El cliente pulsa Comprar, indica la cantidad y confirma. El servidor obtiene su Cliente y el precio actual, crea Venta y descuenta stock sin procesar pagos. Mis compras filtra por la cuenta. La prueba de AM descontó el stock de 5 a 3; al retirar la compra técnica volvió a 5. El personal mantiene su CRUD y las reglas de precio histórico explicadas en el modelo.</w:t>
       </w:r>
     </w:p>
     <w:p>
@@ -3612,7 +3709,7 @@
         <w:widowControl/>
       </w:pPr>
       <w:r>
-        <w:t>El 3 de octubre de 2026 terminaron correctamente 43 pruebas, manage.py check, la revisión de migraciones pendientes y pip check. Después de retirar los datos temporales, el smoke test confirmó las rutas y la existencia de las 50 imágenes. docs/evidencias/verificacion_local.txt registra los resultados. Estas comprobaciones locales deben complementarse con MySQL y el servidor real.</w:t>
+        <w:t>El 3 de octubre de 2026 terminaron correctamente 73 pruebas Django y 6 comprobaciones JavaScript. Se revisaron registro, compras propias, precio, stock y permisos, además de check y migraciones. El smoke test confirma rutas e imágenes originales. docs/evidencias/verificacion_local.txt reúne resultados locales. Falta comprobar MySQL y el servidor real.</w:t>
       </w:r>
     </w:p>
     <w:p>
@@ -4057,7 +4154,7 @@
         <w:widowControl/>
       </w:pPr>
       <w:r>
-        <w:t>La aplicación utiliza Django Authentication, la ruta cuentas/ y una plantilla propia de login. Una persona sin sesión es dirigida al inicio de sesión cuando solicita una vista protegida. Al autenticarse correctamente entra al inicio. Cerrar sesión envía POST con csrf_token y vuelve al login.</w:t>
+        <w:t>El inicio es público y muestra Registrarse e Iniciar sesión. Las vistas protegidas exigen sesión. Django Authentication gestiona el login; el registro válido inicia sesión con la nueva cuenta. Cerrar sesión utiliza POST con csrf_token y vuelve al login.</w:t>
       </w:r>
     </w:p>
     <w:tbl>
@@ -4137,7 +4234,7 @@
                 <w:b/>
                 <w:sz w:val="20"/>
               </w:rPr>
-              <w:t>Consultar y buscar</w:t>
+              <w:t>Consultar</w:t>
             </w:r>
           </w:p>
         </w:tc>
@@ -4168,7 +4265,7 @@
                 <w:b/>
                 <w:sz w:val="20"/>
               </w:rPr>
-              <w:t>Crear y editar</w:t>
+              <w:t>Registrar o editar</w:t>
             </w:r>
           </w:p>
         </w:tc>
@@ -4295,7 +4392,7 @@
                 <w:b w:val="0"/>
                 <w:sz w:val="20"/>
               </w:rPr>
-              <w:t>Sí</w:t>
+              <w:t>Todos los datos</w:t>
             </w:r>
           </w:p>
         </w:tc>
@@ -4325,7 +4422,7 @@
                 <w:b w:val="0"/>
                 <w:sz w:val="20"/>
               </w:rPr>
-              <w:t>Sí</w:t>
+              <w:t>CRUD completo</w:t>
             </w:r>
           </w:p>
         </w:tc>
@@ -4450,7 +4547,7 @@
                 <w:b w:val="0"/>
                 <w:sz w:val="20"/>
               </w:rPr>
-              <w:t>Sí</w:t>
+              <w:t>Todos los datos</w:t>
             </w:r>
           </w:p>
         </w:tc>
@@ -4480,7 +4577,7 @@
                 <w:b w:val="0"/>
                 <w:sz w:val="20"/>
               </w:rPr>
-              <w:t>Sí</w:t>
+              <w:t>Crear y editar</w:t>
             </w:r>
           </w:p>
         </w:tc>
@@ -4605,7 +4702,7 @@
                 <w:b w:val="0"/>
                 <w:sz w:val="20"/>
               </w:rPr>
-              <w:t>Sí</w:t>
+              <w:t>Todos los datos</w:t>
             </w:r>
           </w:p>
         </w:tc>
@@ -4700,6 +4797,161 @@
           </w:p>
         </w:tc>
       </w:tr>
+      <w:tr>
+        <w:trPr>
+          <w:cantSplit/>
+        </w:trPr>
+        <w:tc>
+          <w:tcPr>
+            <w:tcW w:type="dxa" w:w="2268"/>
+            <w:vAlign w:val="center"/>
+            <w:tcBorders>
+              <w:top w:val="single" w:sz="4" w:color="D9D9D9"/>
+              <w:left w:val="single" w:sz="4" w:color="D9D9D9"/>
+              <w:bottom w:val="single" w:sz="4" w:color="D9D9D9"/>
+              <w:right w:val="single" w:sz="4" w:color="D9D9D9"/>
+            </w:tcBorders>
+            <w:tcMar>
+              <w:top w:w="65" w:type="dxa"/>
+              <w:left w:w="65" w:type="dxa"/>
+              <w:bottom w:w="65" w:type="dxa"/>
+              <w:right w:w="65" w:type="dxa"/>
+            </w:tcMar>
+          </w:tcPr>
+          <w:p>
+            <w:pPr>
+              <w:spacing w:after="40" w:before="40" w:line="245" w:lineRule="auto"/>
+            </w:pPr>
+            <w:r>
+              <w:rPr>
+                <w:b w:val="0"/>
+                <w:sz w:val="20"/>
+              </w:rPr>
+              <w:t>Cliente</w:t>
+            </w:r>
+          </w:p>
+        </w:tc>
+        <w:tc>
+          <w:tcPr>
+            <w:tcW w:type="dxa" w:w="2154"/>
+            <w:vAlign w:val="center"/>
+            <w:tcBorders>
+              <w:top w:val="single" w:sz="4" w:color="D9D9D9"/>
+              <w:left w:val="single" w:sz="4" w:color="D9D9D9"/>
+              <w:bottom w:val="single" w:sz="4" w:color="D9D9D9"/>
+              <w:right w:val="single" w:sz="4" w:color="D9D9D9"/>
+            </w:tcBorders>
+            <w:tcMar>
+              <w:top w:w="65" w:type="dxa"/>
+              <w:left w:w="65" w:type="dxa"/>
+              <w:bottom w:w="65" w:type="dxa"/>
+              <w:right w:w="65" w:type="dxa"/>
+            </w:tcMar>
+          </w:tcPr>
+          <w:p>
+            <w:pPr>
+              <w:spacing w:after="40" w:before="40" w:line="245" w:lineRule="auto"/>
+            </w:pPr>
+            <w:r>
+              <w:rPr>
+                <w:b w:val="0"/>
+                <w:sz w:val="20"/>
+              </w:rPr>
+              <w:t>Catálogo y compras propias</w:t>
+            </w:r>
+          </w:p>
+        </w:tc>
+        <w:tc>
+          <w:tcPr>
+            <w:tcW w:type="dxa" w:w="1984"/>
+            <w:vAlign w:val="center"/>
+            <w:tcBorders>
+              <w:top w:val="single" w:sz="4" w:color="D9D9D9"/>
+              <w:left w:val="single" w:sz="4" w:color="D9D9D9"/>
+              <w:bottom w:val="single" w:sz="4" w:color="D9D9D9"/>
+              <w:right w:val="single" w:sz="4" w:color="D9D9D9"/>
+            </w:tcBorders>
+            <w:tcMar>
+              <w:top w:w="65" w:type="dxa"/>
+              <w:left w:w="65" w:type="dxa"/>
+              <w:bottom w:w="65" w:type="dxa"/>
+              <w:right w:w="65" w:type="dxa"/>
+            </w:tcMar>
+          </w:tcPr>
+          <w:p>
+            <w:pPr>
+              <w:spacing w:after="40" w:before="40" w:line="245" w:lineRule="auto"/>
+            </w:pPr>
+            <w:r>
+              <w:rPr>
+                <w:b w:val="0"/>
+                <w:sz w:val="20"/>
+              </w:rPr>
+              <w:t>Comprar; sin CRUD general</w:t>
+            </w:r>
+          </w:p>
+        </w:tc>
+        <w:tc>
+          <w:tcPr>
+            <w:tcW w:type="dxa" w:w="1531"/>
+            <w:vAlign w:val="center"/>
+            <w:tcBorders>
+              <w:top w:val="single" w:sz="4" w:color="D9D9D9"/>
+              <w:left w:val="single" w:sz="4" w:color="D9D9D9"/>
+              <w:bottom w:val="single" w:sz="4" w:color="D9D9D9"/>
+              <w:right w:val="single" w:sz="4" w:color="D9D9D9"/>
+            </w:tcBorders>
+            <w:tcMar>
+              <w:top w:w="65" w:type="dxa"/>
+              <w:left w:w="65" w:type="dxa"/>
+              <w:bottom w:w="65" w:type="dxa"/>
+              <w:right w:w="65" w:type="dxa"/>
+            </w:tcMar>
+          </w:tcPr>
+          <w:p>
+            <w:pPr>
+              <w:spacing w:after="40" w:before="40" w:line="245" w:lineRule="auto"/>
+            </w:pPr>
+            <w:r>
+              <w:rPr>
+                <w:b w:val="0"/>
+                <w:sz w:val="20"/>
+              </w:rPr>
+              <w:t>No</w:t>
+            </w:r>
+          </w:p>
+        </w:tc>
+        <w:tc>
+          <w:tcPr>
+            <w:tcW w:type="dxa" w:w="1701"/>
+            <w:vAlign w:val="center"/>
+            <w:tcBorders>
+              <w:top w:val="single" w:sz="4" w:color="D9D9D9"/>
+              <w:left w:val="single" w:sz="4" w:color="D9D9D9"/>
+              <w:bottom w:val="single" w:sz="4" w:color="D9D9D9"/>
+              <w:right w:val="single" w:sz="4" w:color="D9D9D9"/>
+            </w:tcBorders>
+            <w:tcMar>
+              <w:top w:w="65" w:type="dxa"/>
+              <w:left w:w="65" w:type="dxa"/>
+              <w:bottom w:w="65" w:type="dxa"/>
+              <w:right w:w="65" w:type="dxa"/>
+            </w:tcMar>
+          </w:tcPr>
+          <w:p>
+            <w:pPr>
+              <w:spacing w:after="40" w:before="40" w:line="245" w:lineRule="auto"/>
+            </w:pPr>
+            <w:r>
+              <w:rPr>
+                <w:b w:val="0"/>
+                <w:sz w:val="20"/>
+              </w:rPr>
+              <w:t>No</w:t>
+            </w:r>
+          </w:p>
+        </w:tc>
+      </w:tr>
     </w:tbl>
     <w:p>
       <w:pPr>
@@ -4712,7 +4964,7 @@
         <w:widowControl/>
       </w:pPr>
       <w:r>
-        <w:t>crear_perfiles configura 24 permisos para Administrador, 12 para Operador y 4 para Consulta. Administrador incluye permisos sobre usuarios y grupos; ingresar a Django Admin requiere además is_staff. Se recomienda un solo grupo por cuenta y evitar permisos individuales que amplíen el perfil asignado. El superusuario conserva todos los permisos.</w:t>
+        <w:t>crear_perfiles configura 24 permisos para Administrador, 12 para Operador, 4 para Consulta y 2 para Cliente. Los dos de Cliente son lectura de artistas y discos. Administrador requiere además is_staff para entrar en Admin. El superusuario tiene todos los permisos.</w:t>
       </w:r>
     </w:p>
     <w:p>
@@ -4732,8 +4984,8 @@
       <w:r>
         <w:drawing>
           <wp:inline xmlns:a="http://schemas.openxmlformats.org/drawingml/2006/main" xmlns:pic="http://schemas.openxmlformats.org/drawingml/2006/picture">
-            <wp:extent cx="4320000" cy="3741204"/>
-            <wp:docPr id="9" name="Picture 9" descr="Rechazo de una acción no permitida durante la prueba local del perfil Consulta."/>
+            <wp:extent cx="4320000" cy="3748549"/>
+            <wp:docPr id="9" name="Picture 9" descr="Inicio público con acceso a registro e inicio de sesión."/>
             <wp:cNvGraphicFramePr>
               <a:graphicFrameLocks noChangeAspect="1"/>
             </wp:cNvGraphicFramePr>
@@ -4741,7 +4993,7 @@
               <a:graphicData uri="http://schemas.openxmlformats.org/drawingml/2006/picture">
                 <pic:pic>
                   <pic:nvPicPr>
-                    <pic:cNvPr id="0" name="14_acceso_denegado.jpg"/>
+                    <pic:cNvPr id="0" name="19_inicio_registro.png"/>
                     <pic:cNvPicPr/>
                   </pic:nvPicPr>
                   <pic:blipFill>
@@ -4753,7 +5005,7 @@
                   <pic:spPr>
                     <a:xfrm>
                       <a:off x="0" y="0"/>
-                      <a:ext cx="4320000" cy="3741204"/>
+                      <a:ext cx="4320000" cy="3748549"/>
                     </a:xfrm>
                     <a:prstGeom prst="rect"/>
                   </pic:spPr>
@@ -4770,7 +5022,7 @@
         <w:widowControl/>
       </w:pPr>
       <w:r>
-        <w:t>Figura 9. Rechazo de una acción no permitida durante la prueba local del perfil Consulta.</w:t>
+        <w:t>Figura 9. Inicio público con acceso a registro e inicio de sesión.</w:t>
       </w:r>
     </w:p>
     <w:p>
@@ -4787,7 +5039,7 @@
         <w:widowControl/>
       </w:pPr>
       <w:r>
-        <w:t>Con Administrador se revisan las operaciones completas; con Operador, alta y modificación sin borrado ni gestión de usuarios; con Consulta, listado y búsqueda sin cambios. También se comprueba una URL prohibida y el cierre de sesión. Las pruebas de permisos se realizan con cuentas separadas para distinguir cada perfil.</w:t>
+        <w:t>Se revisan los cuatro perfiles con cuentas separadas. Cliente no entra al CRUD general: comprar y ver Mis compras exigen su Cliente vinculado. El servidor filtra las ventas por esa relación. También se prueba una URL prohibida y el cierre de sesión.</w:t>
       </w:r>
     </w:p>
     <w:p>
@@ -4814,7 +5066,16 @@
         <w:widowControl/>
       </w:pPr>
       <w:r>
-        <w:t>La evaluación exige un repositorio GitHub propio con historial de commits y una aplicación operativa en EC2, con la base dentro de la instancia y revisión desde phpMyAdmin. Se creó el historial Git local en la rama main, con el commit 97a13c9. La cuenta GitHub está verificada, pero no hay un repositorio visible del proyecto ni un remoto configurado. La publicación, la clonación en EC2 y el despliegue siguen pendientes.</w:t>
+        <w:t>El proyecto está publicado en el repositorio público ale13camp/FeriaNewMix-BackEnd. El commit 0440b5f de main incluye registro, compras de clientes y precio automático. Se confirmó el remoto y que su árbol coincide con la versión local publicada. Tiene historial real: bf00c3d fue la primera publicación completa. La clonación en EC2, el despliegue, MySQL y phpMyAdmin aún no se han realizado.</w:t>
+      </w:r>
+    </w:p>
+    <w:p>
+      <w:pPr>
+        <w:pStyle w:val="Nota"/>
+        <w:widowControl/>
+      </w:pPr>
+      <w:r>
+        <w:t>Repositorio: https://github.com/ale13camp/FeriaNewMix-BackEnd</w:t>
       </w:r>
     </w:p>
     <w:tbl>
@@ -4923,7 +5184,7 @@
                 <w:b/>
                 <w:sz w:val="20"/>
               </w:rPr>
-              <w:t>Evidencia que falta</w:t>
+              <w:t>Comprobación siguiente</w:t>
             </w:r>
           </w:p>
         </w:tc>
@@ -4988,7 +5249,7 @@
                 <w:b w:val="0"/>
                 <w:sz w:val="20"/>
               </w:rPr>
-              <w:t>Operativa con SQLite; catálogo importado y pruebas locales.</w:t>
+              <w:t>Operativa con SQLite; 73 pruebas Django y 6 de JavaScript.</w:t>
             </w:r>
           </w:p>
         </w:tc>
@@ -5083,7 +5344,7 @@
                 <w:b w:val="0"/>
                 <w:sz w:val="20"/>
               </w:rPr>
-              <w:t>Historial Git local creado; publicación y remoto pendientes.</w:t>
+              <w:t>Proyecto publicado en main: 0440b5f; registro y compras incluidos.</w:t>
             </w:r>
           </w:p>
         </w:tc>
@@ -5113,7 +5374,7 @@
                 <w:b w:val="0"/>
                 <w:sz w:val="20"/>
               </w:rPr>
-              <w:t>URL propia, historial publicado y git remote -v.</w:t>
+              <w:t>Clonar y comprobar esa versión en EC2.</w:t>
             </w:r>
           </w:p>
         </w:tc>
@@ -5519,7 +5780,7 @@
         <w:widowControl/>
       </w:pPr>
       <w:r>
-        <w:t>1. Confirmar URL del repositorio, IP o DNS, sistema operativo, usuario SSH y ruta de la clave privada. Subir el código, migraciones, README y .env.example conservando commits reales y excluyendo secretos y archivos locales.</w:t>
+        <w:t>1. Revisar la versión publicada del repositorio indicado y confirmar IP o DNS, sistema operativo, usuario SSH y ruta de la clave privada. El código, migraciones, README y .env.example están versionados; se excluyen secretos, entornos virtuales y archivos locales.</w:t>
       </w:r>
     </w:p>
     <w:p>
@@ -5527,7 +5788,7 @@
         <w:widowControl/>
       </w:pPr>
       <w:r>
-        <w:t>2. Entrar a EC2 por SSH y clonar con git clone URL_DEL_REPOSITORIO. Crear un entorno Linux propio e instalar requirements.txt. Configurar MySQL dentro de la instancia y completar .env con sus valores reales.</w:t>
+        <w:t>2. Entrar a EC2 por SSH y clonar el repositorio FeriaNewMix-BackEnd con git clone. Crear un entorno Linux propio e instalar requirements.txt. Configurar MySQL dentro de la instancia y completar .env con sus valores reales.</w:t>
       </w:r>
     </w:p>
     <w:p>
@@ -5543,7 +5804,7 @@
         <w:widowControl/>
       </w:pPr>
       <w:r>
-        <w:t>4. Abrir el sitio real y revisar CRUD, stock, archivos y los tres perfiles. Confirmar el motor mysql desde Django y revisar desde phpMyAdmin las mismas tablas y registros. Registrar las salidas y capturas reales de la clonación, servicios, base y navegador.</w:t>
+        <w:t>4. Abrir el sitio real y revisar CRUD, registro, compras, stock, archivos y los cuatro perfiles. Confirmar el motor mysql desde Django y revisar desde phpMyAdmin las mismas tablas y registros. Registrar las salidas y capturas reales de la clonación, servicios, base y navegador.</w:t>
       </w:r>
     </w:p>
     <w:p>
@@ -5613,7 +5874,7 @@
         <w:widowControl/>
       </w:pPr>
       <w:r>
-        <w:t>Resumen identificado de la respuesta, no transcripción literal: Codex revisó la evaluación, las fuentes y el proyecto. Propuso incorporar Cliente y Venta al catálogo; el usuario aceptó. El apoyo se aplicó a modelos ORM, formularios, CRUD, stock, perfiles, archivos y documentación. La configuración y los resultados se comprobaron localmente. GitHub, EC2, MySQL y phpMyAdmin conservan el estado pendiente descrito en este informe.</w:t>
+        <w:t>Resumen identificado de la respuesta, no transcripción literal: Codex revisó evaluación, fuentes y proyecto. El usuario aceptó incorporar Cliente y Venta; después solicitó registro desde el inicio y compra con descuento de stock, sin pago real. El apoyo se aplicó a modelos, formularios, CRUD, precio, perfiles, registro, compras, archivos y documentación. Los resultados se comprobaron localmente. GitHub conserva el estado indicado; EC2, MySQL y phpMyAdmin siguen pendientes.</w:t>
       </w:r>
     </w:p>
     <w:p>

</xml_diff>

<commit_message>
Actualiza informe y evidencias del perfil del cliente
</commit_message>
<xml_diff>
--- a/docs/Documento tecnico Feria NewMix.docx
+++ b/docs/Documento tecnico Feria NewMix.docx
@@ -35,7 +35,7 @@
         <w:widowControl/>
       </w:pPr>
       <w:r>
-        <w:t>Revisión técnica del 3 de octubre de 2026. Capturas de administración del 2 de octubre y de Admin y compras del 3 de octubre.</w:t>
+        <w:t>Revisión técnica del 3 de octubre de 2026. Evidencias del 2 y 3 de octubre de 2026.</w:t>
       </w:r>
     </w:p>
     <w:p>
@@ -52,7 +52,7 @@
         <w:widowControl/>
       </w:pPr>
       <w:r>
-        <w:t>Feria NewMix permite administrar artistas, discos y clientes, además de registrar ventas. Desde el inicio público, una persona puede crear su cuenta de cliente, iniciar sesión, comprar discos y consultar sus compras. El proyecto amplía el catálogo musical con información almacenada en una base de datos relacional, formularios y permisos.</w:t>
+        <w:t>Feria NewMix permite administrar artistas, discos y clientes, además de registrar ventas. Desde el inicio público, una persona puede crear su cuenta, iniciar sesión, comprar discos y consultar sus compras con portadas y filtros. El cliente también puede editar sus datos y cambiar su contraseña. El proyecto amplía el catálogo musical mediante una base de datos relacional, formularios y permisos.</w:t>
       </w:r>
     </w:p>
     <w:p>
@@ -77,7 +77,7 @@
         <w:widowControl/>
       </w:pPr>
       <w:r>
-        <w:t>Organizar el catálogo musical y registrar ventas que relacionen un cliente con un disco, manteniendo cantidades y precios coherentes. El personal administra los datos según permisos. El cliente puede registrarse, comprar y revisar únicamente sus propias compras.</w:t>
+        <w:t>Organizar el catálogo musical y registrar ventas que relacionen un cliente con un disco, manteniendo cantidades y precios coherentes. El personal administra los datos según permisos. El cliente puede registrarse, mantener su perfil, comprar y revisar únicamente sus propias compras.</w:t>
       </w:r>
     </w:p>
     <w:p>
@@ -119,7 +119,7 @@
         <w:widowControl/>
       </w:pPr>
       <w:r>
-        <w:t>Las capturas de clientes, ventas y compras corresponden a demostraciones técnicas identificadas como prueba y con correos example.com. No representan clientes ni compras reales. Se conservan como evidencia de las operaciones realizadas, aunque los registros temporales se retiren después.</w:t>
+        <w:t>Las capturas de clientes, ventas y compras corresponden a demostraciones técnicas identificadas como prueba y con correos de demostración. No representan clientes ni compras reales. Se conservan como evidencia de las operaciones realizadas, aunque los registros temporales se retiren después.</w:t>
       </w:r>
     </w:p>
     <w:p>
@@ -548,7 +548,7 @@
                 <w:b w:val="0"/>
                 <w:sz w:val="20"/>
               </w:rPr>
-              <w:t>Registro de clientes y creación de los cuatro grupos de permisos.</w:t>
+              <w:t>Registro, perfil, contraseña y cuatro grupos de permisos.</w:t>
             </w:r>
           </w:p>
         </w:tc>
@@ -834,7 +834,7 @@
         <w:widowControl/>
       </w:pPr>
       <w:r>
-        <w:t>config/urls.py utiliza include() para conectar artistas/, discos/, ventas/ y cuentas/, además de admin/ e inicio. Cada aplicación mantiene su urls.py. Las plantillas enlazan los nombres de rutas con {% url %}. La compra utiliza /ventas/comprar/&lt;id&gt;/ y el registro utiliza /cuentas/registro/.</w:t>
+        <w:t>config/urls.py conecta las aplicaciones mediante include(). Cada una tiene su urls.py. Las plantillas enlazan nombres de rutas con {% url %}. La compra usa /ventas/comprar/&lt;id&gt;/; cuentas/ incluye registro/, perfil/ y cambiar-contrasena/, además de las rutas de sesión.</w:t>
       </w:r>
     </w:p>
     <w:tbl>
@@ -2311,7 +2311,7 @@
         <w:widowControl/>
       </w:pPr>
       <w:r>
-        <w:t>migrate aplica las migraciones, incluida 0002_cliente_usuario que vincula Cliente con la cuenta. makemigrations se usa al modificar modelos. importar_catalogo agrega datos originales que no existen y copia imágenes a media/, conservando IDs y ediciones al repetirlo.</w:t>
+        <w:t>migrate aplica las migraciones, incluida 0002_cliente_usuario que vincula Cliente con la cuenta. Las mejoras de perfil no requieren modelos ni migraciones nuevos. makemigrations se usa al modificar modelos. importar_catalogo agrega datos originales que faltan y copia imágenes a media/, conservando IDs y ediciones al repetirlo.</w:t>
       </w:r>
     </w:p>
     <w:p>
@@ -2993,7 +2993,7 @@
         <w:widowControl/>
       </w:pPr>
       <w:r>
-        <w:t>6 CRUD listado y búsqueda</w:t>
+        <w:t>6 CRUD listado búsqueda y Mi perfil</w:t>
       </w:r>
     </w:p>
     <w:p>
@@ -3013,8 +3013,8 @@
       <w:r>
         <w:drawing>
           <wp:inline xmlns:a="http://schemas.openxmlformats.org/drawingml/2006/main" xmlns:pic="http://schemas.openxmlformats.org/drawingml/2006/picture">
-            <wp:extent cx="6120000" cy="3444617"/>
-            <wp:docPr id="3" name="Picture 3" descr="Listado de los 37 discos importados con precio stock y acciones."/>
+            <wp:extent cx="5400000" cy="3039368"/>
+            <wp:docPr id="3" name="Picture 3" descr="Búsqueda de discos desde la interfaz web."/>
             <wp:cNvGraphicFramePr>
               <a:graphicFrameLocks noChangeAspect="1"/>
             </wp:cNvGraphicFramePr>
@@ -3022,7 +3022,7 @@
               <a:graphicData uri="http://schemas.openxmlformats.org/drawingml/2006/picture">
                 <pic:pic>
                   <pic:nvPicPr>
-                    <pic:cNvPr id="0" name="03_discos.jpg"/>
+                    <pic:cNvPr id="0" name="04_busqueda.jpg"/>
                     <pic:cNvPicPr/>
                   </pic:nvPicPr>
                   <pic:blipFill>
@@ -3034,7 +3034,7 @@
                   <pic:spPr>
                     <a:xfrm>
                       <a:off x="0" y="0"/>
-                      <a:ext cx="6120000" cy="3444617"/>
+                      <a:ext cx="5400000" cy="3039368"/>
                     </a:xfrm>
                     <a:prstGeom prst="rect"/>
                   </pic:spPr>
@@ -3051,7 +3051,32 @@
         <w:widowControl/>
       </w:pPr>
       <w:r>
-        <w:t>Figura 3. Listado de los 37 discos importados con precio stock y acciones.</w:t>
+        <w:t>Figura 3. Búsqueda de discos desde la interfaz web.</w:t>
+      </w:r>
+    </w:p>
+    <w:p>
+      <w:pPr>
+        <w:widowControl/>
+      </w:pPr>
+      <w:r>
+        <w:t>Las búsquedas utilizan filter() y expresiones Q con icontains para coincidencias parciales. select_related() obtiene las relaciones utilizadas en las listas. Los resultados se entregan al contexto de la plantilla y reflejan la base de datos actual.</w:t>
+      </w:r>
+    </w:p>
+    <w:p>
+      <w:pPr>
+        <w:pStyle w:val="Subseccion"/>
+        <w:widowControl/>
+      </w:pPr>
+      <w:r>
+        <w:t>Edición del perfil propio</w:t>
+      </w:r>
+    </w:p>
+    <w:p>
+      <w:pPr>
+        <w:widowControl/>
+      </w:pPr>
+      <w:r>
+        <w:t>Mi perfil usa PerfilClienteForm, un ModelForm para nombre, correo y teléfono. El usuario se muestra sin permitir su edición. El servidor obtiene el Cliente de la sesión, sin aceptar el ID de otra cuenta. Guarda juntos el perfil y el nombre y correo de User mediante transaction.atomic().</w:t>
       </w:r>
     </w:p>
     <w:p>
@@ -3059,12 +3084,13 @@
         <w:keepNext/>
         <w:widowControl/>
         <w:spacing w:after="60"/>
+        <w:jc w:val="center"/>
       </w:pPr>
       <w:r>
         <w:drawing>
           <wp:inline xmlns:a="http://schemas.openxmlformats.org/drawingml/2006/main" xmlns:pic="http://schemas.openxmlformats.org/drawingml/2006/picture">
-            <wp:extent cx="6120000" cy="3444617"/>
-            <wp:docPr id="4" name="Picture 4" descr="Búsqueda de discos desde la interfaz web."/>
+            <wp:extent cx="2880000" cy="2987222"/>
+            <wp:docPr id="4" name="Picture 4" descr="Mi perfil permite editar los datos propios y conserva el nombre de usuario."/>
             <wp:cNvGraphicFramePr>
               <a:graphicFrameLocks noChangeAspect="1"/>
             </wp:cNvGraphicFramePr>
@@ -3072,11 +3098,12 @@
               <a:graphicData uri="http://schemas.openxmlformats.org/drawingml/2006/picture">
                 <pic:pic>
                   <pic:nvPicPr>
-                    <pic:cNvPr id="0" name="04_busqueda.jpg"/>
+                    <pic:cNvPr id="0" name="23_mi_perfil.png"/>
                     <pic:cNvPicPr/>
                   </pic:nvPicPr>
                   <pic:blipFill>
                     <a:blip r:embed="rId13"/>
+                    <a:srcRect l="24000" t="16000" r="24000" b="27000"/>
                     <a:stretch>
                       <a:fillRect/>
                     </a:stretch>
@@ -3084,7 +3111,7 @@
                   <pic:spPr>
                     <a:xfrm>
                       <a:off x="0" y="0"/>
-                      <a:ext cx="6120000" cy="3444617"/>
+                      <a:ext cx="2880000" cy="2987222"/>
                     </a:xfrm>
                     <a:prstGeom prst="rect"/>
                   </pic:spPr>
@@ -3101,15 +3128,7 @@
         <w:widowControl/>
       </w:pPr>
       <w:r>
-        <w:t>Figura 4. Búsqueda de discos desde la interfaz web.</w:t>
-      </w:r>
-    </w:p>
-    <w:p>
-      <w:pPr>
-        <w:widowControl/>
-      </w:pPr>
-      <w:r>
-        <w:t>Las búsquedas utilizan filter() y expresiones Q con icontains para coincidencias parciales. select_related() obtiene las relaciones utilizadas en las listas. Los resultados se entregan al contexto de la plantilla y reflejan la base de datos actual.</w:t>
+        <w:t>Figura 4. Mi perfil permite editar los datos propios y conserva el nombre de usuario.</w:t>
       </w:r>
     </w:p>
     <w:p>
@@ -3194,12 +3213,13 @@
         <w:keepNext/>
         <w:widowControl/>
         <w:spacing w:after="60"/>
+        <w:jc w:val="center"/>
       </w:pPr>
       <w:r>
         <w:drawing>
           <wp:inline xmlns:a="http://schemas.openxmlformats.org/drawingml/2006/main" xmlns:pic="http://schemas.openxmlformats.org/drawingml/2006/picture">
-            <wp:extent cx="5400000" cy="3039368"/>
-            <wp:docPr id="6" name="Picture 6" descr="Mis compras muestra únicamente las ventas de la cuenta autenticada."/>
+            <wp:extent cx="5400000" cy="2327165"/>
+            <wp:docPr id="6" name="Picture 6" descr="Filtro de Toxicity para el 2 de octubre de 2026 con portada y precio."/>
             <wp:cNvGraphicFramePr>
               <a:graphicFrameLocks noChangeAspect="1"/>
             </wp:cNvGraphicFramePr>
@@ -3207,11 +3227,12 @@
               <a:graphicData uri="http://schemas.openxmlformats.org/drawingml/2006/picture">
                 <pic:pic>
                   <pic:nvPicPr>
-                    <pic:cNvPr id="0" name="22_mis_compras.png"/>
+                    <pic:cNvPr id="0" name="25_mis_compras_filtros.png"/>
                     <pic:cNvPicPr/>
                   </pic:nvPicPr>
                   <pic:blipFill>
                     <a:blip r:embed="rId15"/>
+                    <a:srcRect l="0" t="0" r="0" b="34000"/>
                     <a:stretch>
                       <a:fillRect/>
                     </a:stretch>
@@ -3219,7 +3240,7 @@
                   <pic:spPr>
                     <a:xfrm>
                       <a:off x="0" y="0"/>
-                      <a:ext cx="5400000" cy="3039368"/>
+                      <a:ext cx="5400000" cy="2327165"/>
                     </a:xfrm>
                     <a:prstGeom prst="rect"/>
                   </pic:spPr>
@@ -3236,7 +3257,7 @@
         <w:widowControl/>
       </w:pPr>
       <w:r>
-        <w:t>Figura 6. Mis compras muestra únicamente las ventas de la cuenta autenticada.</w:t>
+        <w:t>Figura 6. Filtro de Toxicity para el 2 de octubre de 2026 con portada y precio.</w:t>
       </w:r>
     </w:p>
     <w:p>
@@ -3244,7 +3265,7 @@
         <w:widowControl/>
       </w:pPr>
       <w:r>
-        <w:t>El cliente pulsa Comprar, indica la cantidad y confirma. El servidor obtiene su Cliente y el precio actual, crea Venta y descuenta stock sin procesar pagos. Mis compras filtra por la cuenta. La prueba de AM descontó el stock de 5 a 3; al retirar la compra técnica volvió a 5. El personal mantiene su CRUD y las reglas de precio histórico explicadas en el modelo.</w:t>
+        <w:t>El cliente pulsa Comprar, indica la cantidad y confirma. El servidor obtiene su Cliente y el precio actual, crea Venta y descuenta stock sin procesar pagos. Mis compras filtra por la cuenta, título del disco y fechas desde y hasta, y muestra portadas. BusquedaComprasForm rechaza fechas inválidas o un rango invertido. La prueba de AM descontó stock de 5 a 3; al retirarla volvió a 5. El personal conserva su CRUD y el precio histórico.</w:t>
       </w:r>
     </w:p>
     <w:p>
@@ -3709,7 +3730,7 @@
         <w:widowControl/>
       </w:pPr>
       <w:r>
-        <w:t>El 3 de octubre de 2026 terminaron correctamente 73 pruebas Django y 6 comprobaciones JavaScript. Se revisaron registro, compras propias, precio, stock y permisos, además de check y migraciones. El smoke test confirma rutas e imágenes originales. docs/evidencias/verificacion_local.txt reúne resultados locales. Falta comprobar MySQL y el servidor real.</w:t>
+        <w:t>El 3 de octubre de 2026 aprobaron 94 pruebas Django y 6 comprobaciones JavaScript. Cubren registro, compras propias, perfil, contraseña, filtros, precio, stock y permisos. check y la revisión de migraciones no detectaron problemas. El smoke test confirma rutas e imágenes originales. docs/evidencias/verificacion_local.txt reúne resultados locales. Falta comprobar MySQL y el servidor real.</w:t>
       </w:r>
     </w:p>
     <w:p>
@@ -4887,7 +4908,7 @@
                 <w:b w:val="0"/>
                 <w:sz w:val="20"/>
               </w:rPr>
-              <w:t>Comprar; sin CRUD general</w:t>
+              <w:t>Comprar y editar su perfil</w:t>
             </w:r>
           </w:p>
         </w:tc>
@@ -4977,15 +4998,33 @@
     </w:p>
     <w:p>
       <w:pPr>
+        <w:pStyle w:val="Subseccion"/>
+        <w:widowControl/>
+      </w:pPr>
+      <w:r>
+        <w:t>Cambio de contraseña</w:t>
+      </w:r>
+    </w:p>
+    <w:p>
+      <w:pPr>
+        <w:widowControl/>
+      </w:pPr>
+      <w:r>
+        <w:t>El cliente introduce la contraseña actual, la nueva y su confirmación. PasswordChangeForm comprueba la actual y valida la nueva; update_session_auth_hash conserva la sesión tras el cambio. Las contraseñas se almacenan con hash. El informe no incluye credenciales reales.</w:t>
+      </w:r>
+    </w:p>
+    <w:p>
+      <w:pPr>
         <w:keepNext/>
         <w:widowControl/>
         <w:spacing w:after="60"/>
+        <w:jc w:val="center"/>
       </w:pPr>
       <w:r>
         <w:drawing>
           <wp:inline xmlns:a="http://schemas.openxmlformats.org/drawingml/2006/main" xmlns:pic="http://schemas.openxmlformats.org/drawingml/2006/picture">
-            <wp:extent cx="4320000" cy="3748549"/>
-            <wp:docPr id="9" name="Picture 9" descr="Inicio público con acceso a registro e inicio de sesión."/>
+            <wp:extent cx="3060000" cy="2791261"/>
+            <wp:docPr id="9" name="Picture 9" descr="Cambio de contraseña con comprobación de la actual y confirmación de la nueva."/>
             <wp:cNvGraphicFramePr>
               <a:graphicFrameLocks noChangeAspect="1"/>
             </wp:cNvGraphicFramePr>
@@ -4993,11 +5032,12 @@
               <a:graphicData uri="http://schemas.openxmlformats.org/drawingml/2006/picture">
                 <pic:pic>
                   <pic:nvPicPr>
-                    <pic:cNvPr id="0" name="19_inicio_registro.png"/>
+                    <pic:cNvPr id="0" name="24_cambiar_contrasena.png"/>
                     <pic:cNvPicPr/>
                   </pic:nvPicPr>
                   <pic:blipFill>
                     <a:blip r:embed="rId18"/>
+                    <a:srcRect l="24000" t="10000" r="24000" b="31000"/>
                     <a:stretch>
                       <a:fillRect/>
                     </a:stretch>
@@ -5005,7 +5045,7 @@
                   <pic:spPr>
                     <a:xfrm>
                       <a:off x="0" y="0"/>
-                      <a:ext cx="4320000" cy="3748549"/>
+                      <a:ext cx="3060000" cy="2791261"/>
                     </a:xfrm>
                     <a:prstGeom prst="rect"/>
                   </pic:spPr>
@@ -5022,7 +5062,7 @@
         <w:widowControl/>
       </w:pPr>
       <w:r>
-        <w:t>Figura 9. Inicio público con acceso a registro e inicio de sesión.</w:t>
+        <w:t>Figura 9. Cambio de contraseña con comprobación de la actual y confirmación de la nueva.</w:t>
       </w:r>
     </w:p>
     <w:p>
@@ -5066,7 +5106,7 @@
         <w:widowControl/>
       </w:pPr>
       <w:r>
-        <w:t>El proyecto está publicado en el repositorio público ale13camp/FeriaNewMix-BackEnd. El commit 0440b5f de main incluye registro, compras de clientes y precio automático. Se confirmó el remoto y que su árbol coincide con la versión local publicada. Tiene historial real: bf00c3d fue la primera publicación completa. La clonación en EC2, el despliegue, MySQL y phpMyAdmin aún no se han realizado.</w:t>
+        <w:t>El proyecto está publicado en el repositorio público ale13camp/FeriaNewMix-BackEnd. El commit 66346a5 de main incluye registro, compras, Mi perfil, cambio de contraseña, filtros y portadas. Se confirmó el remoto y que su árbol coincide con la versión local publicada. Tiene historial real: bf00c3d fue la primera publicación completa. La clonación en EC2, el despliegue, MySQL y phpMyAdmin aún no se han realizado.</w:t>
       </w:r>
     </w:p>
     <w:p>
@@ -5249,7 +5289,7 @@
                 <w:b w:val="0"/>
                 <w:sz w:val="20"/>
               </w:rPr>
-              <w:t>Operativa con SQLite; 73 pruebas Django y 6 de JavaScript.</w:t>
+              <w:t>Operativa con SQLite; 94 pruebas Django y 6 de JavaScript.</w:t>
             </w:r>
           </w:p>
         </w:tc>
@@ -5344,7 +5384,7 @@
                 <w:b w:val="0"/>
                 <w:sz w:val="20"/>
               </w:rPr>
-              <w:t>Proyecto publicado en main: 0440b5f; registro y compras incluidos.</w:t>
+              <w:t>Publicado en main: 66346a5; mejoras del cliente incluidas.</w:t>
             </w:r>
           </w:p>
         </w:tc>
@@ -5874,7 +5914,7 @@
         <w:widowControl/>
       </w:pPr>
       <w:r>
-        <w:t>Resumen identificado de la respuesta, no transcripción literal: Codex revisó evaluación, fuentes y proyecto. El usuario aceptó incorporar Cliente y Venta; después solicitó registro desde el inicio y compra con descuento de stock, sin pago real. El apoyo se aplicó a modelos, formularios, CRUD, precio, perfiles, registro, compras, archivos y documentación. Los resultados se comprobaron localmente. GitHub conserva el estado indicado; EC2, MySQL y phpMyAdmin siguen pendientes.</w:t>
+        <w:t>Resumen identificado de la respuesta, no transcripción literal: Codex revisó evaluación, fuentes y proyecto. El usuario aceptó incorporar Cliente y Venta; después solicitó registro, compra con descuento de stock sin pago real, Mi perfil, cambio de contraseña y mejoras de Mis compras. El apoyo se aplicó a modelos, formularios, CRUD, precio, perfiles, compras, archivos y documentación. Los resultados se comprobaron localmente. GitHub conserva el estado indicado; EC2, MySQL y phpMyAdmin siguen pendientes.</w:t>
       </w:r>
     </w:p>
     <w:p>

</xml_diff>

<commit_message>
Completa evidencias EC2 y documentación de las rúbricas
</commit_message>
<xml_diff>
--- a/docs/Documento tecnico Feria NewMix.docx
+++ b/docs/Documento tecnico Feria NewMix.docx
@@ -33,9 +33,10 @@
       <w:pPr>
         <w:pStyle w:val="Nota"/>
         <w:widowControl/>
+        <w:outlineLvl w:val="9"/>
       </w:pPr>
       <w:r>
-        <w:t>Revisión técnica del 3 de octubre de 2026. Evidencias del 2 y 3 de octubre de 2026.</w:t>
+        <w:t>Revisión actualizada el 5 de octubre de 2026. Evidencias locales del 2 al 4 de octubre y despliegue comprobado el 4 de octubre de 2026.</w:t>
       </w:r>
     </w:p>
     <w:p>
@@ -58,9 +59,10 @@
     <w:p>
       <w:pPr>
         <w:widowControl/>
+        <w:outlineLvl w:val="9"/>
       </w:pPr>
       <w:r>
-        <w:t>La aplicación funciona y se ha comprobado localmente con SQLite. Incluye modelos ORM, migraciones, CRUD desde la web y Django Admin, imágenes, documentos PDF y cuatro perfiles. El proyecto está publicado en GitHub. El despliegue en EC2 y la revisión de MySQL desde phpMyAdmin siguen pendientes. Por ello, este documento no declara completados todos los requisitos de la evaluación.</w:t>
+        <w:t>La aplicación cuenta con modelos ORM, migraciones, CRUD web y Django Admin, imágenes, documentos PDF y cuatro perfiles. El proyecto está publicado en GitHub. El 4 de octubre de 2026 se desplegó en EC2 con MariaDB, Gunicorn y NGINX; phpMyAdmin mostró las tablas y relaciones de la misma base. Se conservan las evidencias locales anteriores y se agregan las remotas al final.</w:t>
       </w:r>
     </w:p>
     <w:p>
@@ -2265,9 +2267,10 @@
     <w:p>
       <w:pPr>
         <w:widowControl/>
+        <w:outlineLvl w:val="9"/>
       </w:pPr>
       <w:r>
-        <w:t>La comprobación local utiliza Django 5.2.17, Python 3.12.14 y SQLite. Las migraciones se aplicaron y el catálogo original se importó con 13 artistas, 37 discos y 50 imágenes. Este resultado local no demuestra el MySQL exigido dentro de EC2.</w:t>
+        <w:t>Las pruebas locales utilizan SQLite. En EC2 se comprobaron Django 5.2.17, Python 3.12.14 y MariaDB 10.11.18 con el backend mysql. Las migraciones están aplicadas. La restauración conservó 13 artistas, 37 discos, 4 clientes, 6 ventas, 5 cuentas y 50 archivos, junto con sus relaciones y stock.</w:t>
       </w:r>
     </w:p>
     <w:p>
@@ -3728,9 +3731,10 @@
     <w:p>
       <w:pPr>
         <w:widowControl/>
+        <w:outlineLvl w:val="9"/>
       </w:pPr>
       <w:r>
-        <w:t>El 3 de octubre de 2026 aprobaron 94 pruebas Django y 6 comprobaciones JavaScript. Cubren registro, compras propias, perfil, contraseña, filtros, precio, stock y permisos. check y la revisión de migraciones no detectaron problemas. El smoke test confirma rutas e imágenes originales. docs/evidencias/verificacion_local.txt reúne resultados locales. Falta comprobar MySQL y el servidor real.</w:t>
+        <w:t>El 3 de octubre aprobaron 94 pruebas Django y 6 comprobaciones JavaScript. La ampliación API alcanzó 129 pruebas Django, repetidas el 4 de octubre en 15,962 s con resultado OK y base temporal. Ese día también aprobaron check, revisión de migraciones, validación OpenAPI y 86 comprobaciones CRUD HTTP sobre MariaDB en EC2. Se conservaron los registros originales.</w:t>
       </w:r>
     </w:p>
     <w:p>
@@ -5096,17 +5100,19 @@
         <w:pStyle w:val="Seccion"/>
         <w:pageBreakBefore/>
         <w:widowControl/>
+        <w:outlineLvl w:val="9"/>
       </w:pPr>
       <w:r>
-        <w:t>11 GitHub EC2 y comprobaciones pendientes</w:t>
+        <w:t>11 GitHub EC2 y comprobaciones remotas</w:t>
       </w:r>
     </w:p>
     <w:p>
       <w:pPr>
         <w:widowControl/>
+        <w:outlineLvl w:val="9"/>
       </w:pPr>
       <w:r>
-        <w:t>El proyecto está publicado en el repositorio público ale13camp/FeriaNewMix-BackEnd. El commit 66346a5 de main incluye registro, compras, Mi perfil, cambio de contraseña, filtros y portadas. Se confirmó el remoto y que su árbol coincide con la versión local publicada. Tiene historial real: bf00c3d fue la primera publicación completa. La clonación en EC2, el despliegue, MySQL y phpMyAdmin aún no se han realizado.</w:t>
+        <w:t>El proyecto está publicado en ale13camp/FeriaNewMix-BackEnd. La versión de la web en main conserva su historial. La rama codex/sumativa-3-api incorpora JWT y Swagger; se desplegó en /var/www/newmix, con código a53105b verificado el 4 de octubre de 2026. Los documentos y guías se actualizan después de esa comprobación, sin alterar los datos importados.</w:t>
       </w:r>
     </w:p>
     <w:p>
@@ -5253,6 +5259,7 @@
           <w:p>
             <w:pPr>
               <w:spacing w:after="40" w:before="40" w:line="245" w:lineRule="auto"/>
+              <w:outlineLvl w:val="9"/>
             </w:pPr>
             <w:r>
               <w:rPr>
@@ -5283,13 +5290,14 @@
           <w:p>
             <w:pPr>
               <w:spacing w:after="40" w:before="40" w:line="245" w:lineRule="auto"/>
+              <w:outlineLvl w:val="9"/>
             </w:pPr>
             <w:r>
               <w:rPr>
                 <w:b w:val="0"/>
                 <w:sz w:val="20"/>
               </w:rPr>
-              <w:t>Operativa con SQLite; 94 pruebas Django y 6 de JavaScript.</w:t>
+              <w:t>129 pruebas Django OK el 4 de octubre; resultados web anteriores conservados.</w:t>
             </w:r>
           </w:p>
         </w:tc>
@@ -5313,13 +5321,14 @@
           <w:p>
             <w:pPr>
               <w:spacing w:after="40" w:before="40" w:line="245" w:lineRule="auto"/>
+              <w:outlineLvl w:val="9"/>
             </w:pPr>
             <w:r>
               <w:rPr>
                 <w:b w:val="0"/>
                 <w:sz w:val="20"/>
               </w:rPr>
-              <w:t>Repetir comprobaciones en el entorno de despliegue.</w:t>
+              <w:t>Explicar modelos, formularios, permisos y stock.</w:t>
             </w:r>
           </w:p>
         </w:tc>
@@ -5348,6 +5357,7 @@
           <w:p>
             <w:pPr>
               <w:spacing w:after="40" w:before="40" w:line="245" w:lineRule="auto"/>
+              <w:outlineLvl w:val="9"/>
             </w:pPr>
             <w:r>
               <w:rPr>
@@ -5378,13 +5388,14 @@
           <w:p>
             <w:pPr>
               <w:spacing w:after="40" w:before="40" w:line="245" w:lineRule="auto"/>
+              <w:outlineLvl w:val="9"/>
             </w:pPr>
             <w:r>
               <w:rPr>
                 <w:b w:val="0"/>
                 <w:sz w:val="20"/>
               </w:rPr>
-              <w:t>Publicado en main: 66346a5; mejoras del cliente incluidas.</w:t>
+              <w:t>Web en main; API en codex/sumativa-3-api; código a53105b desplegado.</w:t>
             </w:r>
           </w:p>
         </w:tc>
@@ -5408,13 +5419,14 @@
           <w:p>
             <w:pPr>
               <w:spacing w:after="40" w:before="40" w:line="245" w:lineRule="auto"/>
+              <w:outlineLvl w:val="9"/>
             </w:pPr>
             <w:r>
               <w:rPr>
                 <w:b w:val="0"/>
                 <w:sz w:val="20"/>
               </w:rPr>
-              <w:t>Clonar y comprobar esa versión en EC2.</w:t>
+              <w:t>Mostrar rama y commit del código usado.</w:t>
             </w:r>
           </w:p>
         </w:tc>
@@ -5443,6 +5455,7 @@
           <w:p>
             <w:pPr>
               <w:spacing w:after="40" w:before="40" w:line="245" w:lineRule="auto"/>
+              <w:outlineLvl w:val="9"/>
             </w:pPr>
             <w:r>
               <w:rPr>
@@ -5473,13 +5486,14 @@
           <w:p>
             <w:pPr>
               <w:spacing w:after="40" w:before="40" w:line="245" w:lineRule="auto"/>
+              <w:outlineLvl w:val="9"/>
             </w:pPr>
             <w:r>
               <w:rPr>
                 <w:b w:val="0"/>
                 <w:sz w:val="20"/>
               </w:rPr>
-              <w:t>Sin acceso ni sitio de este proyecto verificados.</w:t>
+              <w:t>Base y web operativas con MariaDB, Gunicorn y NGINX el 4 de octubre.</w:t>
             </w:r>
           </w:p>
         </w:tc>
@@ -5503,13 +5517,14 @@
           <w:p>
             <w:pPr>
               <w:spacing w:after="40" w:before="40" w:line="245" w:lineRule="auto"/>
+              <w:outlineLvl w:val="9"/>
             </w:pPr>
             <w:r>
               <w:rPr>
                 <w:b w:val="0"/>
                 <w:sz w:val="20"/>
               </w:rPr>
-              <w:t>IP o DNS, SSH, entorno, servicios y página real.</w:t>
+              <w:t>Reactivar laboratorio y comprobar IP actual.</w:t>
             </w:r>
           </w:p>
         </w:tc>
@@ -5538,13 +5553,14 @@
           <w:p>
             <w:pPr>
               <w:spacing w:after="40" w:before="40" w:line="245" w:lineRule="auto"/>
+              <w:outlineLvl w:val="9"/>
             </w:pPr>
             <w:r>
               <w:rPr>
                 <w:b w:val="0"/>
                 <w:sz w:val="20"/>
               </w:rPr>
-              <w:t>MySQL en EC2</w:t>
+              <w:t>MariaDB en EC2</w:t>
             </w:r>
           </w:p>
         </w:tc>
@@ -5568,13 +5584,14 @@
           <w:p>
             <w:pPr>
               <w:spacing w:after="40" w:before="40" w:line="245" w:lineRule="auto"/>
+              <w:outlineLvl w:val="9"/>
             </w:pPr>
             <w:r>
               <w:rPr>
                 <w:b w:val="0"/>
                 <w:sz w:val="20"/>
               </w:rPr>
-              <w:t>Configuración disponible; conexión pendiente.</w:t>
+              <w:t>Backend mysql; migraciones y registros restaurados comprobados.</w:t>
             </w:r>
           </w:p>
         </w:tc>
@@ -5598,13 +5615,14 @@
           <w:p>
             <w:pPr>
               <w:spacing w:after="40" w:before="40" w:line="245" w:lineRule="auto"/>
+              <w:outlineLvl w:val="9"/>
             </w:pPr>
             <w:r>
               <w:rPr>
                 <w:b w:val="0"/>
                 <w:sz w:val="20"/>
               </w:rPr>
-              <w:t>Motor mysql, migraciones, tablas y registros.</w:t>
+              <w:t>Mostrar la conexión newmix y sus relaciones.</w:t>
             </w:r>
           </w:p>
         </w:tc>
@@ -5633,6 +5651,7 @@
           <w:p>
             <w:pPr>
               <w:spacing w:after="40" w:before="40" w:line="245" w:lineRule="auto"/>
+              <w:outlineLvl w:val="9"/>
             </w:pPr>
             <w:r>
               <w:rPr>
@@ -5663,13 +5682,14 @@
           <w:p>
             <w:pPr>
               <w:spacing w:after="40" w:before="40" w:line="245" w:lineRule="auto"/>
+              <w:outlineLvl w:val="9"/>
             </w:pPr>
             <w:r>
               <w:rPr>
                 <w:b w:val="0"/>
                 <w:sz w:val="20"/>
               </w:rPr>
-              <w:t>Sin captura de la base real en EC2.</w:t>
+              <w:t>Tablas, cantidades y 13 relaciones vistas desde el túnel SSH.</w:t>
             </w:r>
           </w:p>
         </w:tc>
@@ -5693,13 +5713,14 @@
           <w:p>
             <w:pPr>
               <w:spacing w:after="40" w:before="40" w:line="245" w:lineRule="auto"/>
+              <w:outlineLvl w:val="9"/>
             </w:pPr>
             <w:r>
               <w:rPr>
                 <w:b w:val="0"/>
                 <w:sz w:val="20"/>
               </w:rPr>
-              <w:t>Tablas, relaciones y registros coherentes con la web.</w:t>
+              <w:t>Reabrir el servidor temporal y túnel para la exposición.</w:t>
             </w:r>
           </w:p>
         </w:tc>
@@ -5728,13 +5749,14 @@
           <w:p>
             <w:pPr>
               <w:spacing w:after="40" w:before="40" w:line="245" w:lineRule="auto"/>
+              <w:outlineLvl w:val="9"/>
             </w:pPr>
             <w:r>
               <w:rPr>
                 <w:b w:val="0"/>
                 <w:sz w:val="20"/>
               </w:rPr>
-              <w:t>Clonación Git en EC2</w:t>
+              <w:t>Git en EC2</w:t>
             </w:r>
           </w:p>
         </w:tc>
@@ -5758,13 +5780,14 @@
           <w:p>
             <w:pPr>
               <w:spacing w:after="40" w:before="40" w:line="245" w:lineRule="auto"/>
+              <w:outlineLvl w:val="9"/>
             </w:pPr>
             <w:r>
               <w:rPr>
                 <w:b w:val="0"/>
                 <w:sz w:val="20"/>
               </w:rPr>
-              <w:t>Pendiente.</w:t>
+              <w:t>Repositorio remoto, rama y código a53105b comprobados.</w:t>
             </w:r>
           </w:p>
         </w:tc>
@@ -5788,13 +5811,14 @@
           <w:p>
             <w:pPr>
               <w:spacing w:after="40" w:before="40" w:line="245" w:lineRule="auto"/>
+              <w:outlineLvl w:val="9"/>
             </w:pPr>
             <w:r>
               <w:rPr>
                 <w:b w:val="0"/>
                 <w:sz w:val="20"/>
               </w:rPr>
-              <w:t>Salida real de git clone y remoto dentro del servidor.</w:t>
+              <w:t>Mostrar git status, branch y log -1 sin secretos.</w:t>
             </w:r>
           </w:p>
         </w:tc>
@@ -5826,25 +5850,28 @@
     <w:p>
       <w:pPr>
         <w:widowControl/>
+        <w:outlineLvl w:val="9"/>
       </w:pPr>
       <w:r>
-        <w:t>2. Entrar a EC2 por SSH y clonar el repositorio FeriaNewMix-BackEnd con git clone. Crear un entorno Linux propio e instalar requirements.txt. Configurar MySQL dentro de la instancia y completar .env con sus valores reales.</w:t>
+        <w:t>2. Comprobar acceso SSH y versión remota: /var/www/newmix utiliza un entorno virtual propio. MariaDB guarda newmix y .env contiene su configuración privada. No se repite la importación sobre la base existente.</w:t>
       </w:r>
     </w:p>
     <w:p>
       <w:pPr>
         <w:widowControl/>
+        <w:outlineLvl w:val="9"/>
       </w:pPr>
       <w:r>
-        <w:t>3. Ejecutar migrate, importar_catalogo, crear_perfiles y collectstatic. Configurar Gunicorn para config.wsgi:application y NGINX como entrada del sitio. La guía docs/despliegue_ec2.md contiene los ejemplos que deben adaptarse al servidor comprobado.</w:t>
+        <w:t>3. Comprobar migraciones y servicios. MariaDB, newmix y NGINX se verificaron activos y habilitados al iniciar. NGINX sirve estáticos e imágenes; Gunicorn ejecuta Django en localhost. docs/despliegue_ec2.md documenta la configuración y las comprobaciones.</w:t>
       </w:r>
     </w:p>
     <w:p>
       <w:pPr>
         <w:widowControl/>
+        <w:outlineLvl w:val="9"/>
       </w:pPr>
       <w:r>
-        <w:t>4. Abrir el sitio real y revisar CRUD, registro, compras, stock, archivos y los cuatro perfiles. Confirmar el motor mysql desde Django y revisar desde phpMyAdmin las mismas tablas y registros. Registrar las salidas y capturas reales de la clonación, servicios, base y navegador.</w:t>
+        <w:t>4. Revisar la misma base desde Django y phpMyAdmin. Las pruebas remotas verificaron JWT, API, perfiles, stock y conservación de registros. Las capturas anteriores conservan su origen local; las pruebas del 5 de octubre agregan 62 comprobaciones web remotas, incluidos formularios y archivos.</w:t>
       </w:r>
     </w:p>
     <w:p>
@@ -5859,9 +5886,10 @@
     <w:p>
       <w:pPr>
         <w:widowControl/>
+        <w:outlineLvl w:val="9"/>
       </w:pPr>
       <w:r>
-        <w:t>Se debe mostrar el mismo registro desde la interfaz, Django Admin y phpMyAdmin: ID del cliente y disco, llaves foráneas de Venta, cantidad, precio y stock. También se debe explicar dónde están los archivos y demostrar una acción permitida y otra rechazada. Las instrucciones anteriores son una guía pendiente, no evidencias de un despliegue realizado.</w:t>
+        <w:t>Durante la revisión presencial se debe mostrar el mismo registro desde web, Django Admin y phpMyAdmin: ID, llaves foráneas, cantidad, precio y stock. También se explica el almacenamiento de archivos y se demuestra una acción permitida y otra rechazada. La base y conectividad remotas ya tienen evidencia; la presentación corresponde al estudiante.</w:t>
       </w:r>
     </w:p>
     <w:p>
@@ -5912,9 +5940,10 @@
     <w:p>
       <w:pPr>
         <w:widowControl/>
+        <w:outlineLvl w:val="9"/>
       </w:pPr>
       <w:r>
-        <w:t>Resumen identificado de la respuesta, no transcripción literal: Codex revisó evaluación, fuentes y proyecto. El usuario aceptó incorporar Cliente y Venta; después solicitó registro, compra con descuento de stock sin pago real, Mi perfil, cambio de contraseña y mejoras de Mis compras. El apoyo se aplicó a modelos, formularios, CRUD, precio, perfiles, compras, archivos y documentación. Los resultados se comprobaron localmente. GitHub conserva el estado indicado; EC2, MySQL y phpMyAdmin siguen pendientes.</w:t>
+        <w:t>Resumen de la respuesta, no transcripción literal: Codex revisó evaluación, fuentes y proyecto. El usuario aceptó Cliente y Venta y luego solicitó registro, compra sin pago real, perfil, contraseña e historial. El apoyo se aplicó a modelos, formularios, CRUD, precio, permisos, archivos y documentación. El 4 de octubre el usuario solicitó continuar EC2 y configurar MariaDB/phpMyAdmin. Se comprobó el acceso antes de cambios y se verificaron base, servicios y datos restaurados.</w:t>
       </w:r>
     </w:p>
     <w:p>
@@ -6818,6 +6847,436 @@
         <w:t>Las fuentes se encuentran en Unidad 1 y 2. docs/fuentes.md detalla las aplicaciones y decisiones añadidas. El código consultado comprende models.py, forms.py, views.py, urls.py, admin.py, config/settings.py, validators.py, storage.py y las plantillas del proyecto.</w:t>
       </w:r>
     </w:p>
+    <w:p>
+      <w:pPr>
+        <w:keepNext/>
+        <w:pageBreakBefore/>
+        <w:outlineLvl w:val="9"/>
+      </w:pPr>
+      <w:r>
+        <w:rPr>
+          <w:b/>
+          <w:sz w:val="30"/>
+        </w:rPr>
+        <w:t>Instancia EC2 activa al 5 de octubre</w:t>
+      </w:r>
+    </w:p>
+    <w:p>
+      <w:pPr>
+        <w:outlineLvl w:val="9"/>
+      </w:pPr>
+      <w:r>
+        <w:t>La consola AWS mostró la instancia existente Servidor Linux en ejecución, con IP pública 35.168.62.2 y DNS ec2-35-168-62-2.compute-1.amazonaws.com. La sesión del laboratorio debe permanecer activa durante la evaluación. El acceso SSH y los servicios también se comprobaron; el log sin secretos está en docs/evidencias_ec2/conectividad_ec2.txt.</w:t>
+      </w:r>
+    </w:p>
+    <w:p>
+      <w:pPr>
+        <w:keepNext/>
+        <w:jc w:val="center"/>
+        <w:outlineLvl w:val="9"/>
+      </w:pPr>
+      <w:r>
+        <w:drawing>
+          <wp:inline xmlns:a="http://schemas.openxmlformats.org/drawingml/2006/main" xmlns:pic="http://schemas.openxmlformats.org/drawingml/2006/picture">
+            <wp:extent cx="6120000" cy="2765215"/>
+            <wp:docPr id="10" name="Picture 10" descr="Evidencia AWS  Instancia en ejecución y dirección pública actual"/>
+            <wp:cNvGraphicFramePr>
+              <a:graphicFrameLocks noChangeAspect="1"/>
+            </wp:cNvGraphicFramePr>
+            <a:graphic>
+              <a:graphicData uri="http://schemas.openxmlformats.org/drawingml/2006/picture">
+                <pic:pic>
+                  <pic:nvPicPr>
+                    <pic:cNvPr id="0" name="ec2_instancia_20261005.png"/>
+                    <pic:cNvPicPr/>
+                  </pic:nvPicPr>
+                  <pic:blipFill>
+                    <a:blip r:embed="rId19"/>
+                    <a:stretch>
+                      <a:fillRect/>
+                    </a:stretch>
+                  </pic:blipFill>
+                  <pic:spPr>
+                    <a:xfrm>
+                      <a:off x="0" y="0"/>
+                      <a:ext cx="6120000" cy="2765215"/>
+                    </a:xfrm>
+                    <a:prstGeom prst="rect"/>
+                  </pic:spPr>
+                </pic:pic>
+              </a:graphicData>
+            </a:graphic>
+          </wp:inline>
+        </w:drawing>
+      </w:r>
+    </w:p>
+    <w:p>
+      <w:pPr>
+        <w:spacing w:after="160"/>
+        <w:outlineLvl w:val="9"/>
+      </w:pPr>
+      <w:r>
+        <w:rPr>
+          <w:sz w:val="18"/>
+        </w:rPr>
+        <w:t>Evidencia AWS  Instancia en ejecución y dirección pública actual</w:t>
+      </w:r>
+    </w:p>
+    <w:p>
+      <w:pPr>
+        <w:keepNext/>
+        <w:pageBreakBefore/>
+        <w:outlineLvl w:val="9"/>
+      </w:pPr>
+      <w:r>
+        <w:rPr>
+          <w:b/>
+          <w:sz w:val="30"/>
+        </w:rPr>
+        <w:t>13 Despliegue y base remota verificados</w:t>
+      </w:r>
+    </w:p>
+    <w:p>
+      <w:pPr>
+        <w:outlineLvl w:val="9"/>
+      </w:pPr>
+      <w:r>
+        <w:t>El 4 de octubre de 2026 se completó la base y la publicación en la instancia existente de Amazon Linux 2023. Se comprobó mysql/newmix/127.0.0.1 desde Django. La IP pública de ese día fue 13.222.64.182; puede cambiar al reiniciar AWS Academy. La web y credenciales de demostración se probaron mediante SSH.</w:t>
+      </w:r>
+    </w:p>
+    <w:p>
+      <w:pPr>
+        <w:keepNext/>
+        <w:jc w:val="center"/>
+        <w:outlineLvl w:val="9"/>
+      </w:pPr>
+      <w:r>
+        <w:drawing>
+          <wp:inline xmlns:a="http://schemas.openxmlformats.org/drawingml/2006/main" xmlns:pic="http://schemas.openxmlformats.org/drawingml/2006/picture">
+            <wp:extent cx="6120000" cy="2764496"/>
+            <wp:docPr id="11" name="Picture 11" descr="Figura 10  Catálogo servido desde EC2 y consultado por túnel SSH"/>
+            <wp:cNvGraphicFramePr>
+              <a:graphicFrameLocks noChangeAspect="1"/>
+            </wp:cNvGraphicFramePr>
+            <a:graphic>
+              <a:graphicData uri="http://schemas.openxmlformats.org/drawingml/2006/picture">
+                <pic:pic>
+                  <pic:nvPicPr>
+                    <pic:cNvPr id="0" name="web_ec2.png"/>
+                    <pic:cNvPicPr/>
+                  </pic:nvPicPr>
+                  <pic:blipFill>
+                    <a:blip r:embed="rId20"/>
+                    <a:stretch>
+                      <a:fillRect/>
+                    </a:stretch>
+                  </pic:blipFill>
+                  <pic:spPr>
+                    <a:xfrm>
+                      <a:off x="0" y="0"/>
+                      <a:ext cx="6120000" cy="2764496"/>
+                    </a:xfrm>
+                    <a:prstGeom prst="rect"/>
+                  </pic:spPr>
+                </pic:pic>
+              </a:graphicData>
+            </a:graphic>
+          </wp:inline>
+        </w:drawing>
+      </w:r>
+    </w:p>
+    <w:p>
+      <w:pPr>
+        <w:spacing w:after="160"/>
+        <w:outlineLvl w:val="9"/>
+      </w:pPr>
+      <w:r>
+        <w:rPr>
+          <w:sz w:val="18"/>
+        </w:rPr>
+        <w:t>Figura 10  Catálogo servido desde EC2 y consultado por túnel SSH</w:t>
+      </w:r>
+    </w:p>
+    <w:p>
+      <w:pPr>
+        <w:keepNext/>
+        <w:jc w:val="center"/>
+        <w:outlineLvl w:val="9"/>
+      </w:pPr>
+      <w:r>
+        <w:drawing>
+          <wp:inline xmlns:a="http://schemas.openxmlformats.org/drawingml/2006/main" xmlns:pic="http://schemas.openxmlformats.org/drawingml/2006/picture">
+            <wp:extent cx="6120000" cy="2944770"/>
+            <wp:docPr id="12" name="Picture 12" descr="Figura 11  phpMyAdmin consulta la base newmix de la instancia EC2"/>
+            <wp:cNvGraphicFramePr>
+              <a:graphicFrameLocks noChangeAspect="1"/>
+            </wp:cNvGraphicFramePr>
+            <a:graphic>
+              <a:graphicData uri="http://schemas.openxmlformats.org/drawingml/2006/picture">
+                <pic:pic>
+                  <pic:nvPicPr>
+                    <pic:cNvPr id="0" name="phpmyadmin_newmix.png"/>
+                    <pic:cNvPicPr/>
+                  </pic:nvPicPr>
+                  <pic:blipFill>
+                    <a:blip r:embed="rId21"/>
+                    <a:stretch>
+                      <a:fillRect/>
+                    </a:stretch>
+                  </pic:blipFill>
+                  <pic:spPr>
+                    <a:xfrm>
+                      <a:off x="0" y="0"/>
+                      <a:ext cx="6120000" cy="2944770"/>
+                    </a:xfrm>
+                    <a:prstGeom prst="rect"/>
+                  </pic:spPr>
+                </pic:pic>
+              </a:graphicData>
+            </a:graphic>
+          </wp:inline>
+        </w:drawing>
+      </w:r>
+    </w:p>
+    <w:p>
+      <w:pPr>
+        <w:spacing w:after="160"/>
+        <w:outlineLvl w:val="9"/>
+      </w:pPr>
+      <w:r>
+        <w:rPr>
+          <w:sz w:val="18"/>
+        </w:rPr>
+        <w:t>Figura 11  phpMyAdmin consulta la base newmix de la instancia EC2</w:t>
+      </w:r>
+    </w:p>
+    <w:p>
+      <w:pPr>
+        <w:keepNext/>
+        <w:pageBreakBefore/>
+        <w:outlineLvl w:val="9"/>
+      </w:pPr>
+      <w:r>
+        <w:rPr>
+          <w:b/>
+          <w:sz w:val="30"/>
+        </w:rPr>
+        <w:t>14 Relaciones pruebas y preparación de la exposición</w:t>
+      </w:r>
+    </w:p>
+    <w:p>
+      <w:pPr>
+        <w:keepNext/>
+        <w:jc w:val="center"/>
+        <w:outlineLvl w:val="9"/>
+      </w:pPr>
+      <w:r>
+        <w:drawing>
+          <wp:inline xmlns:a="http://schemas.openxmlformats.org/drawingml/2006/main" xmlns:pic="http://schemas.openxmlformats.org/drawingml/2006/picture">
+            <wp:extent cx="6120000" cy="2764496"/>
+            <wp:docPr id="13" name="Picture 13" descr="Figura 12  Relaciones reales entre las tablas de MariaDB en EC2"/>
+            <wp:cNvGraphicFramePr>
+              <a:graphicFrameLocks noChangeAspect="1"/>
+            </wp:cNvGraphicFramePr>
+            <a:graphic>
+              <a:graphicData uri="http://schemas.openxmlformats.org/drawingml/2006/picture">
+                <pic:pic>
+                  <pic:nvPicPr>
+                    <pic:cNvPr id="0" name="phpmyadmin_relaciones.png"/>
+                    <pic:cNvPicPr/>
+                  </pic:nvPicPr>
+                  <pic:blipFill>
+                    <a:blip r:embed="rId22"/>
+                    <a:stretch>
+                      <a:fillRect/>
+                    </a:stretch>
+                  </pic:blipFill>
+                  <pic:spPr>
+                    <a:xfrm>
+                      <a:off x="0" y="0"/>
+                      <a:ext cx="6120000" cy="2764496"/>
+                    </a:xfrm>
+                    <a:prstGeom prst="rect"/>
+                  </pic:spPr>
+                </pic:pic>
+              </a:graphicData>
+            </a:graphic>
+          </wp:inline>
+        </w:drawing>
+      </w:r>
+    </w:p>
+    <w:p>
+      <w:pPr>
+        <w:spacing w:after="160"/>
+        <w:outlineLvl w:val="9"/>
+      </w:pPr>
+      <w:r>
+        <w:rPr>
+          <w:sz w:val="18"/>
+        </w:rPr>
+        <w:t>Figura 12  Relaciones reales entre las tablas de MariaDB en EC2</w:t>
+      </w:r>
+    </w:p>
+    <w:p>
+      <w:pPr>
+        <w:outlineLvl w:val="9"/>
+      </w:pPr>
+      <w:r>
+        <w:t>La restauración conservó 5 cuentas, 13 artistas, 37 discos, 4 clientes, 6 ventas y 50 archivos. Las pruebas API HTTP verificaron stock y permisos sobre datos temporales; al finalizar coincidieron los registros originales completos. Los respaldos SQL y los archivos de traslado permanecen privados.</w:t>
+      </w:r>
+    </w:p>
+    <w:p>
+      <w:pPr>
+        <w:outlineLvl w:val="9"/>
+      </w:pPr>
+      <w:r>
+        <w:t>Los servicios MariaDB, Gunicorn y NGINX están habilitados al iniciar. phpMyAdmin se usa sólo para la demostración privada: puerto remoto 8081 en localhost y acceso por SSH. No se abrieron 3306, 8000 ni 8081 a Internet. HTTPS debe configurarse antes de usar contraseñas por la URL pública; la sesión del laboratorio debe estar activa para la presentación.</w:t>
+      </w:r>
+    </w:p>
+    <w:p>
+      <w:pPr>
+        <w:outlineLvl w:val="9"/>
+      </w:pPr>
+      <w:r>
+        <w:t>El 5 de octubre se renovó el laboratorio y se comprobó la nueva IP 35.168.62.2. Se actualizó SSH al origen del PC autorizado. MariaDB inicia mediante el socket habilitado y una dependencia Requires/After del servicio, conservando el puerto 3306 limitado a localhost. phpMyAdmin se comprobó nuevamente después del reinicio.</w:t>
+      </w:r>
+    </w:p>
+    <w:p>
+      <w:pPr>
+        <w:keepNext/>
+        <w:pageBreakBefore/>
+        <w:outlineLvl w:val="9"/>
+      </w:pPr>
+      <w:r>
+        <w:rPr>
+          <w:b/>
+          <w:sz w:val="30"/>
+        </w:rPr>
+        <w:t>15 Formularios y archivos remotos</w:t>
+      </w:r>
+    </w:p>
+    <w:p>
+      <w:pPr>
+        <w:outlineLvl w:val="9"/>
+      </w:pPr>
+      <w:r>
+        <w:t>El 5 de octubre aprobaron 62 comprobaciones web en EC2: formularios, validación, búsqueda, filtros, Django Admin, perfiles y archivos. La imagen y el PDF descargados coincidieron exactamente por SHA256. La ruta directa del PDF privado respondió 404; su descarga controlada requirió autenticación. El cierre agregó 14 comprobaciones de limpieza y originales: 76 en total.</w:t>
+      </w:r>
+    </w:p>
+    <w:p>
+      <w:pPr>
+        <w:keepNext/>
+        <w:jc w:val="center"/>
+        <w:outlineLvl w:val="9"/>
+      </w:pPr>
+      <w:r>
+        <w:drawing>
+          <wp:inline xmlns:a="http://schemas.openxmlformats.org/drawingml/2006/main" xmlns:pic="http://schemas.openxmlformats.org/drawingml/2006/picture">
+            <wp:extent cx="6120000" cy="2945472"/>
+            <wp:docPr id="14" name="Picture 14" descr="Figura 13  Disco temporal con imagen y enlace al PDF protegido en EC2"/>
+            <wp:cNvGraphicFramePr>
+              <a:graphicFrameLocks noChangeAspect="1"/>
+            </wp:cNvGraphicFramePr>
+            <a:graphic>
+              <a:graphicData uri="http://schemas.openxmlformats.org/drawingml/2006/picture">
+                <pic:pic>
+                  <pic:nvPicPr>
+                    <pic:cNvPr id="0" name="web_detalle_pdf_ec2.png"/>
+                    <pic:cNvPicPr/>
+                  </pic:nvPicPr>
+                  <pic:blipFill>
+                    <a:blip r:embed="rId23"/>
+                    <a:stretch>
+                      <a:fillRect/>
+                    </a:stretch>
+                  </pic:blipFill>
+                  <pic:spPr>
+                    <a:xfrm>
+                      <a:off x="0" y="0"/>
+                      <a:ext cx="6120000" cy="2945472"/>
+                    </a:xfrm>
+                    <a:prstGeom prst="rect"/>
+                  </pic:spPr>
+                </pic:pic>
+              </a:graphicData>
+            </a:graphic>
+          </wp:inline>
+        </w:drawing>
+      </w:r>
+    </w:p>
+    <w:p>
+      <w:pPr>
+        <w:spacing w:after="160"/>
+        <w:outlineLvl w:val="9"/>
+      </w:pPr>
+      <w:r>
+        <w:rPr>
+          <w:sz w:val="18"/>
+        </w:rPr>
+        <w:t>Figura 13  Disco temporal con imagen y enlace al PDF protegido en EC2</w:t>
+      </w:r>
+    </w:p>
+    <w:p>
+      <w:pPr>
+        <w:keepNext/>
+        <w:jc w:val="center"/>
+        <w:outlineLvl w:val="9"/>
+      </w:pPr>
+      <w:r>
+        <w:drawing>
+          <wp:inline xmlns:a="http://schemas.openxmlformats.org/drawingml/2006/main" xmlns:pic="http://schemas.openxmlformats.org/drawingml/2006/picture">
+            <wp:extent cx="6120000" cy="2944770"/>
+            <wp:docPr id="15" name="Picture 15" descr="Figura 14  Búsqueda y filtros sobre el registro temporal en EC2"/>
+            <wp:cNvGraphicFramePr>
+              <a:graphicFrameLocks noChangeAspect="1"/>
+            </wp:cNvGraphicFramePr>
+            <a:graphic>
+              <a:graphicData uri="http://schemas.openxmlformats.org/drawingml/2006/picture">
+                <pic:pic>
+                  <pic:nvPicPr>
+                    <pic:cNvPr id="0" name="web_filtro_ec2.png"/>
+                    <pic:cNvPicPr/>
+                  </pic:nvPicPr>
+                  <pic:blipFill>
+                    <a:blip r:embed="rId24"/>
+                    <a:stretch>
+                      <a:fillRect/>
+                    </a:stretch>
+                  </pic:blipFill>
+                  <pic:spPr>
+                    <a:xfrm>
+                      <a:off x="0" y="0"/>
+                      <a:ext cx="6120000" cy="2944770"/>
+                    </a:xfrm>
+                    <a:prstGeom prst="rect"/>
+                  </pic:spPr>
+                </pic:pic>
+              </a:graphicData>
+            </a:graphic>
+          </wp:inline>
+        </w:drawing>
+      </w:r>
+    </w:p>
+    <w:p>
+      <w:pPr>
+        <w:spacing w:after="160"/>
+        <w:outlineLvl w:val="9"/>
+      </w:pPr>
+      <w:r>
+        <w:rPr>
+          <w:sz w:val="18"/>
+        </w:rPr>
+        <w:t>Figura 14  Búsqueda y filtros sobre el registro temporal en EC2</w:t>
+      </w:r>
+    </w:p>
+    <w:p>
+      <w:pPr>
+        <w:outlineLvl w:val="9"/>
+      </w:pPr>
+      <w:r>
+        <w:t>Después de las capturas se eliminaron sólo el registro temporal y sus dos archivos. Los datos originales permanecieron iguales: 4 clientes, 37 discos y 6 ventas. docs/Guion_demostracion.md organiza la exposición y docs/evidencias_ec2 reúne capturas y resultados. El informe no sustituye la explicación presencial.</w:t>
+      </w:r>
+    </w:p>
     <w:sectPr>
       <w:footerReference w:type="default" r:id="rId9"/>
       <w:pgSz w:w="11906" w:h="16838"/>

</xml_diff>